<commit_message>
docs(entrega): aclara en Metodologia la explicacion por parcela de la app
</commit_message>
<xml_diff>
--- a/reports/entrega/01_Informe_CebadaVision.docx
+++ b/reports/entrega/01_Informe_CebadaVision.docx
@@ -336,7 +336,7 @@
         <w:rPr>
           <w:rFonts w:ascii="Calibri" w:cs="Calibri" w:eastAsia="Calibri" w:hAnsi="Calibri"/>
         </w:rPr>
-        <w:t xml:space="preserve"> Para cada parcela e índice tomamos la serie del promedio del polígono, la suavizamos con una mediana móvil de tres observaciones y calculamos: mediana de cada mes de abril a noviembre, medianas por ventana (mayo–junio, julio–septiembre, octubre–noviembre), valor y fecha del máximo, amplitud, área bajo la curva de abril a octubre, inicio y fin de la temporada verde (cuando la curva cruza la mitad de su amplitud al subir y al bajar), duración y velocidades de crecimiento y de secado. Resultaron 80 variables de Planet y 160 de Sentinel-2 (NDVI, EVI, SAVI, LAI, fAPAR, NDWI, MSI, NDTI). El clima se resumió en lluvia acumulada abril–octubre, temperaturas mínima y máxima medias del ciclo y anomalía de lluvia respecto al promedio 2022–2024; por la resolución del ráster, estas variables solo toman 25 valores distintos en las 197 parcelas. El relieve aporta elevación media, su variación y pendiente media. La ubicación se representó con las coordenadas del centroide (EPSG:6372, en km), la zona (k-means de tres grupos sobre los centroides, sin usar el rendimiento), el rendimiento promedio de la zona y el promedio, ponderado por distancia, del rendimiento de las ocho parcelas de entrenamiento más cercanas.</w:t>
+        <w:t xml:space="preserve"> Para cada parcela e índice tomamos la serie del promedio del polígono, la suavizamos con una mediana móvil de tres observaciones y calculamos: mediana de cada mes de abril a noviembre, medianas por ventana (mayo–junio, julio–septiembre, octubre–noviembre), valor y fecha del máximo, amplitud, área bajo la curva de abril a octubre, inicio y fin de la temporada verde (cuando la curva cruza la mitad de su amplitud al subir y al bajar), duración y velocidades de crecimiento y de secado. Resultaron 80 variables de Planet y 160 de Sentinel-2 (NDVI, EVI, SAVI, LAI, fAPAR, NDWI, MSI, NDTI). El clima se resumió en lluvia acumulada abril–octubre, temperaturas mínima y máxima medias del ciclo y anomalía de lluvia respecto al promedio 2022–2024; por la resolución del ráster, estas variables solo toman 25 valores distintos en las 197 parcelas. El relieve aporta elevación media, su variación y pendiente media. La ubicación se representó con las coordenadas del centroide (km), la zona (k-means de tres grupos sobre los centroides, sin usar el rendimiento), el rendimiento promedio de la zona y el promedio ponderado por distancia del rendimiento de las ocho parcelas de entrenamiento más cercanas.</w:t>
       </w:r>
     </w:p>
     <w:p>
@@ -396,7 +396,7 @@
         <w:rPr>
           <w:rFonts w:ascii="Calibri" w:cs="Calibri" w:eastAsia="Calibri" w:hAnsi="Calibri"/>
         </w:rPr>
-        <w:t xml:space="preserve"> Es el promedio de dos modelos: LightGBM con ubicación, relieve y clima (11 variables) y Random Forest con ubicación, fenología de Planet, clima y relieve (91 variables). La predicción se recorta al rango plausible de 1.5 a 6.5 t/ha. El rango de predicción al 80 % se calcula como ±1.28 veces el RMSE de validación. La explicación de cada parcela usa valores SHAP (Lundberg y Lee, 2017) promediados entre ambos modelos, agrupados por tipo de variable y traducidos a una nota en lenguaje sencillo. Para que la aplicación ejecute el modelo en el navegador ajustamos una regresión ridge sustituta sobre 11 variables interpretables y reportamos cuánto difiere del ensamble.</w:t>
+        <w:t xml:space="preserve"> Es el promedio de dos modelos: LightGBM con ubicación, relieve y clima (11 variables) y Random Forest con ubicación, fenología de Planet, clima y relieve (91 variables). La predicción se recorta al rango plausible de 1.5 a 6.5 t/ha. El rango de predicción al 80 % se calcula como ±1.28 veces el RMSE de validación. Para explicar cada predicción en la aplicación se calculan valores SHAP (Lundberg y Lee, 2017) promediados entre ambos modelos y agrupados por tipo de variable; con ellos la ficha de cada parcela indica qué factores subieron o bajaron su estimación. Para que la aplicación ejecute el modelo en el navegador ajustamos una regresión ridge sustituta sobre 11 variables y reportamos cuánto difiere del ensamble.</w:t>
       </w:r>
     </w:p>
     <w:p>

</xml_diff>

<commit_message>
docs(entrega): registro academico impersonal en el informe
</commit_message>
<xml_diff>
--- a/reports/entrega/01_Informe_CebadaVision.docx
+++ b/reports/entrega/01_Informe_CebadaVision.docx
@@ -69,19 +69,19 @@
         <w:rPr>
           <w:rFonts w:ascii="Calibri" w:cs="Calibri" w:eastAsia="Calibri" w:hAnsi="Calibri"/>
         </w:rPr>
-        <w:t xml:space="preserve">Saber cuánto va a rendir una parcela sin visitarla, y para todas las parcelas de una región, es un problema abierto con valor público directo. Los satélites lo hacen posible: Sentinel-2 pasa cada cinco días con píxeles de 10 m y constelaciones como Planet observan casi a diario con píxeles de 3 m. Los estudios recientes muestran que los modelos de aprendizaje automático que combinan estas series con clima y relieve explican buena parte de la variación del rendimiento en cultivos de temporal (van Klompenburg et al., 2020; de la Fuente et al., 2023), aunque su desempeño depende de cuántas parcelas se tengan, de qué tan confiable sea el dato de rendimiento y de cómo estén repartidas.</w:t>
-      </w:r>
-    </w:p>
-    <w:p>
-      <w:pPr>
-        <w:spacing w:after="140" w:line="288"/>
-        <w:jc w:val="both"/>
-      </w:pPr>
-      <w:r>
-        <w:rPr>
-          <w:rFonts w:ascii="Calibri" w:cs="Calibri" w:eastAsia="Calibri" w:hAnsi="Calibri"/>
-        </w:rPr>
-        <w:t xml:space="preserve">El Reto AgroCebada 2026 plantea exactamente ese problema con datos reales: 197 parcelas de cebada de temporal del ciclo abril–octubre de 2025 en Hidalgo, Tlaxcala y Puebla, con índices de vegetación de Sentinel-2, Landsat y Planet, precipitación y temperatura mensuales, elevación y pendiente. El rendimiento de grano (toneladas por hectárea) se conoce para 138 parcelas; el de las otras 59 lo guarda el comité para calificar las predicciones. Ese rendimiento viene, en la mayoría de los casos, del registro de compra de la comercializadora, no de una medición en campo, así que trae ruido y, en algunas zonas, está redondeado a medias toneladas.</w:t>
+        <w:t xml:space="preserve">Estimar el rendimiento de una parcela sin visitarla, y hacerlo para todas las parcelas de una región, es un problema abierto con valor público directo. Los satélites lo hacen posible: Sentinel-2 pasa cada cinco días con píxeles de 10 m y constelaciones como Planet observan casi a diario con píxeles de 3 m. Los estudios recientes muestran que los modelos de aprendizaje automático que combinan estas series con clima y relieve explican buena parte de la variación del rendimiento en cultivos de temporal (van Klompenburg et al., 2020; de la Fuente et al., 2023), aunque su desempeño depende de cuántas parcelas se tengan, de qué tan confiable sea el dato de rendimiento y de cómo estén repartidas.</w:t>
+      </w:r>
+    </w:p>
+    <w:p>
+      <w:pPr>
+        <w:spacing w:after="140" w:line="288"/>
+        <w:jc w:val="both"/>
+      </w:pPr>
+      <w:r>
+        <w:rPr>
+          <w:rFonts w:ascii="Calibri" w:cs="Calibri" w:eastAsia="Calibri" w:hAnsi="Calibri"/>
+        </w:rPr>
+        <w:t xml:space="preserve">El Reto AgroCebada 2026 plantea exactamente ese problema con datos reales: 197 parcelas de cebada de temporal del ciclo abril–octubre de 2025 en Hidalgo, Tlaxcala y Puebla, con índices de vegetación de Sentinel-2, Landsat y Planet, precipitación y temperatura mensuales, elevación y pendiente. El rendimiento de grano (toneladas por hectárea) se conoce para 138 parcelas; el de las otras 59 lo resguarda el comité para calificar las predicciones. Ese rendimiento proviene, en la mayoría de los casos, del registro de compra de la comercializadora y no de una medición en campo, por lo que contiene ruido y, en algunas zonas, está redondeado a medias toneladas.</w:t>
       </w:r>
     </w:p>
     <w:p>
@@ -119,7 +119,7 @@
         <w:rPr>
           <w:rFonts w:ascii="Calibri" w:cs="Calibri" w:eastAsia="Calibri" w:hAnsi="Calibri"/>
         </w:rPr>
-        <w:t xml:space="preserve"> de esa estructura. Ese mismo marco es el que usamos para responder las tres preguntas guía del reto.</w:t>
+        <w:t xml:space="preserve"> de esa estructura. Ese mismo marco se utiliza para responder las tres preguntas guía del reto.</w:t>
       </w:r>
     </w:p>
     <w:p>
@@ -316,7 +316,7 @@
         <w:rPr>
           <w:rFonts w:ascii="Calibri" w:cs="Calibri" w:eastAsia="Calibri" w:hAnsi="Calibri"/>
         </w:rPr>
-        <w:t xml:space="preserve"> Usamos únicamente el dataset oficial: 197 polígonos (138 de entrenamiento y 59 por predecir), 47 804 observaciones de Planet (NDVI, EVI, LAI, MSAVI) de 2025, 107 666 de Sentinel-2 y Landsat de 2022 a 2025 (22 índices), rásteres mensuales de precipitación (CHIRPS) y de temperatura mínima y máxima a unos 5 km, y elevación y pendiente del Continuo de Elevaciones Mexicano. Una auditoría confirmó 197 identificadores únicos en todas las fuentes, la unión sin pérdidas entre shapefile y tablas, y el reparto 138/59. Trabajamos con el ciclo abril–octubre de 2025 (más noviembre, para ver el secado). Las observaciones con nubosidad del 100 % se descartaron porque traen los índices vacíos; no se rellenó ninguna. Landsat no aporta índices en 2025.</w:t>
+        <w:t xml:space="preserve"> Se utilizó únicamente el dataset oficial: 197 polígonos (138 de entrenamiento y 59 por predecir), 47 804 observaciones de Planet (NDVI, EVI, LAI, MSAVI) de 2025, 107 666 de Sentinel-2 y Landsat de 2022 a 2025 (22 índices), rásteres mensuales de precipitación (CHIRPS) y de temperatura mínima y máxima a unos 5 km, y elevación y pendiente del Continuo de Elevaciones Mexicano. Una auditoría confirmó 197 identificadores únicos en todas las fuentes, la unión sin pérdidas entre shapefile y tablas, y el reparto 138/59. Se trabajó con el ciclo abril–octubre de 2025 (más noviembre, para capturar la senescencia). Las observaciones con nubosidad del 100 % se descartaron porque traen los índices vacíos; no se imputó ninguna. Landsat no aporta índices en 2025.</w:t>
       </w:r>
     </w:p>
     <w:p>
@@ -336,7 +336,7 @@
         <w:rPr>
           <w:rFonts w:ascii="Calibri" w:cs="Calibri" w:eastAsia="Calibri" w:hAnsi="Calibri"/>
         </w:rPr>
-        <w:t xml:space="preserve"> Para cada parcela e índice tomamos la serie del promedio del polígono, la suavizamos con una mediana móvil de tres observaciones y calculamos: mediana de cada mes de abril a noviembre, medianas por ventana (mayo–junio, julio–septiembre, octubre–noviembre), valor y fecha del máximo, amplitud, área bajo la curva de abril a octubre, inicio y fin de la temporada verde (cuando la curva cruza la mitad de su amplitud al subir y al bajar), duración y velocidades de crecimiento y de secado. Resultaron 80 variables de Planet y 160 de Sentinel-2 (NDVI, EVI, SAVI, LAI, fAPAR, NDWI, MSI, NDTI). El clima se resumió en lluvia acumulada abril–octubre, temperaturas mínima y máxima medias del ciclo y anomalía de lluvia respecto al promedio 2022–2024; por la resolución del ráster, estas variables solo toman 25 valores distintos en las 197 parcelas. El relieve aporta elevación media, su variación y pendiente media. La ubicación se representó con las coordenadas del centroide (km), la zona (k-means de tres grupos sobre los centroides, sin usar el rendimiento), el rendimiento promedio de la zona y el promedio ponderado por distancia del rendimiento de las ocho parcelas de entrenamiento más cercanas.</w:t>
+        <w:t xml:space="preserve"> Para cada parcela e índice se tomó la serie del promedio del polígono, se suavizó con una mediana móvil de tres observaciones y se calcularon: mediana de cada mes de abril a noviembre, medianas por ventana (mayo–junio, julio–septiembre, octubre–noviembre), valor y fecha del máximo, amplitud, área bajo la curva de abril a octubre, inicio y fin de la temporada verde (cuando la curva cruza la mitad de su amplitud al subir y al bajar), duración y velocidades de crecimiento y de secado. Resultaron 80 variables de Planet y 160 de Sentinel-2 (NDVI, EVI, SAVI, LAI, fAPAR, NDWI, MSI, NDTI). El clima se resumió en lluvia acumulada abril–octubre, temperaturas mínima y máxima medias del ciclo y anomalía de lluvia respecto al promedio 2022–2024; por la resolución del ráster, estas variables solo toman 25 valores distintos en las 197 parcelas. El relieve aporta elevación media, su variación y pendiente media. La ubicación se representó con las coordenadas del centroide (km), la zona (k-means de tres grupos sobre los centroides, sin usar el rendimiento), el rendimiento promedio de la zona y el promedio ponderado por distancia del rendimiento de las ocho parcelas de entrenamiento más cercanas.</w:t>
       </w:r>
     </w:p>
     <w:p>
@@ -356,7 +356,7 @@
         <w:rPr>
           <w:rFonts w:ascii="Calibri" w:cs="Calibri" w:eastAsia="Calibri" w:hAnsi="Calibri"/>
         </w:rPr>
-        <w:t xml:space="preserve"> La métrica principal es el RMSE (criterio de FIRA), con MAE y R². Usamos validación cruzada de 5 particiones estratificadas por estado —imita el reparto oficial 70/30, proporcional por zona y espacialmente mezclado— repetida 10 veces con semillas distintas; reportamos promedio y desviación entre repeticiones, y tratamos como ruido cualquier diferencia de RMSE menor a 0.03 t/ha. Como prueba más exigente añadimos una validación agrupada por municipio. Las variables de vecinos y de zona se recalculan dentro de cada partición solo con las parcelas de entrenamiento de esa partición (y sin contar a la propia parcela), de modo que el rendimiento de una parcela nunca entra en sus propias variables ni en las de las parcelas con las que se evalúa.</w:t>
+        <w:t xml:space="preserve"> La métrica principal es el RMSE (criterio de FIRA), con MAE y R². Se usó validación cruzada de 5 particiones estratificadas por estado —imita el reparto oficial 70/30, proporcional por zona y espacialmente mezclado— repetida 10 veces con semillas distintas; se reporta promedio y desviación entre repeticiones, y se considera ruido cualquier diferencia de RMSE menor a 0.03 t/ha. Como prueba más exigente se añadió una validación agrupada por municipio. Las variables de vecinos y de zona se recalculan dentro de cada partición solo con las parcelas de entrenamiento de esa partición (y sin contar a la propia parcela), de modo que el rendimiento de una parcela nunca entra en sus propias variables ni en las de las parcelas con las que se evalúa.</w:t>
       </w:r>
     </w:p>
     <w:p>
@@ -376,7 +376,7 @@
         <w:rPr>
           <w:rFonts w:ascii="Calibri" w:cs="Calibri" w:eastAsia="Calibri" w:hAnsi="Calibri"/>
         </w:rPr>
-        <w:t xml:space="preserve"> Comparamos regresión ridge, Random Forest (400 árboles, hoja mínima de 3, 33 % de variables por partición), un LightGBM pequeño (300 árboles, tasa 0.03, 7 hojas, submuestreo, regularización L2) y un proceso gaussiano con núcleo RBF más ruido; los faltantes se rellenan con la mediana de entrenamiento dentro de cada ajuste. El banco de experimentos evaluó cada grupo de variables por separado, la ubicación más cada grupo, combinaciones completas y ensambles por promedio. Para las preguntas guía evaluamos cada índice con sus variables fenológicas y cada variable climática, solos y con la ubicación fija, calculamos la importancia por permutación del modelo final (cuánto sube el RMSE al barajar cada variable) y una ablación por grupos.</w:t>
+        <w:t xml:space="preserve"> Se compararon regresión ridge, Random Forest (400 árboles, hoja mínima de 3, 33 % de variables por partición), un LightGBM pequeño (300 árboles, tasa 0.03, 7 hojas, submuestreo, regularización L2) y un proceso gaussiano con núcleo RBF más ruido; los faltantes se rellenan con la mediana de entrenamiento dentro de cada ajuste. El banco de experimentos evaluó cada grupo de variables por separado, la ubicación más cada grupo, combinaciones completas y ensambles por promedio. Para las preguntas guía se evaluó cada índice con sus variables fenológicas y cada variable climática, solos y con la ubicación fija, y se calcularon la importancia por permutación del modelo final (aumento del RMSE al barajar cada variable) y una ablación por grupos.</w:t>
       </w:r>
     </w:p>
     <w:p>
@@ -396,7 +396,7 @@
         <w:rPr>
           <w:rFonts w:ascii="Calibri" w:cs="Calibri" w:eastAsia="Calibri" w:hAnsi="Calibri"/>
         </w:rPr>
-        <w:t xml:space="preserve"> Es el promedio de dos modelos: LightGBM con ubicación, relieve y clima (11 variables) y Random Forest con ubicación, fenología de Planet, clima y relieve (91 variables). La predicción se recorta al rango plausible de 1.5 a 6.5 t/ha. El rango de predicción al 80 % se calcula como ±1.28 veces el RMSE de validación. Para explicar cada predicción en la aplicación se calculan valores SHAP (Lundberg y Lee, 2017) promediados entre ambos modelos y agrupados por tipo de variable; con ellos la ficha de cada parcela indica qué factores subieron o bajaron su estimación. Para que la aplicación ejecute el modelo en el navegador ajustamos una regresión ridge sustituta sobre 11 variables y reportamos cuánto difiere del ensamble.</w:t>
+        <w:t xml:space="preserve"> Es el promedio de dos modelos: LightGBM con ubicación, relieve y clima (11 variables) y Random Forest con ubicación, fenología de Planet, clima y relieve (91 variables). La predicción se recorta al rango plausible de 1.5 a 6.5 t/ha. El rango de predicción al 80 % se calcula como ±1.28 veces el RMSE de validación. Para explicar cada predicción en la aplicación se calculan valores SHAP (Lundberg y Lee, 2017) promediados entre ambos modelos y agrupados por tipo de variable; con ellos la ficha de cada parcela indica qué factores subieron o bajaron su estimación. Para que la aplicación ejecute el modelo en el navegador se ajustó una regresión ridge sustituta sobre 11 variables y se reporta cuánto difiere del ensamble.</w:t>
       </w:r>
     </w:p>
     <w:p>
@@ -453,7 +453,7 @@
         <w:rPr>
           <w:rFonts w:ascii="Calibri" w:cs="Calibri" w:eastAsia="Calibri" w:hAnsi="Calibri"/>
         </w:rPr>
-        <w:t xml:space="preserve"> Predecir el promedio de entrenamiento da RMSE 0.851 t/ha (R² −0.02). Un kNN espacial que solo mira a las ocho parcelas vecinas baja a 0.501 (R² 0.65): la ubicación sola explica cerca de dos tercios de la variación y es la vara real que cualquier modelo debía superar.</w:t>
+        <w:t xml:space="preserve"> Predecir el promedio de entrenamiento da RMSE 0.851 t/ha (R² −0.02). Un kNN espacial que solo usa las ocho parcelas vecinas baja a 0.501 (R² 0.65): la ubicación por sí sola explica cerca de dos tercios de la variación y es la referencia que cualquier modelo debe superar.</w:t>
       </w:r>
     </w:p>
     <w:p>
@@ -473,7 +473,7 @@
         <w:rPr>
           <w:rFonts w:ascii="Calibri" w:cs="Calibri" w:eastAsia="Calibri" w:hAnsi="Calibri"/>
         </w:rPr>
-        <w:t xml:space="preserve"> (CV 5×10, LightGBM). Solo coordenadas: 0.507; solo vecinos: 0.502; solo clima: 0.545; solo fenología de Planet: 0.625; solo Sentinel-2: 0.636; solo estadísticos simples de Planet (media, desviación, máximo, mínimo): 0.784; solo relieve: 0.762. La fenología completa vale mucho más que los estadísticos simples, porque la señal agronómica está al inicio del ciclo y en el secado, no en el máximo, que se satura en agosto–septiembre. Y el clima "predice" bien aunque solo tenga 25 valores distintos: funciona como etiqueta de zona.</w:t>
+        <w:t xml:space="preserve"> (CV 5×10, LightGBM). Solo coordenadas: 0.507; solo vecinos: 0.502; solo clima: 0.545; solo fenología de Planet: 0.625; solo Sentinel-2: 0.636; solo estadísticos simples de Planet (media, desviación, máximo, mínimo): 0.784; solo relieve: 0.762. La fenología completa vale mucho más que los estadísticos simples, porque la señal agronómica está al inicio del ciclo y en el secado, no en el máximo, que se satura en agosto–septiembre. El clima predice bien pese a tomar solo 25 valores distintos: opera, en la práctica, como indicador de zona.</w:t>
       </w:r>
     </w:p>
     <w:p>
@@ -513,7 +513,7 @@
         <w:rPr>
           <w:rFonts w:ascii="Calibri" w:cs="Calibri" w:eastAsia="Calibri" w:hAnsi="Calibri"/>
         </w:rPr>
-        <w:t xml:space="preserve"> El ensamble LightGBM (ubicación, relieve, clima) + Random Forest (ubicación, fenología Planet, clima, relieve) obtiene RMSE 0.491 ± 0.007, MAE 0.336 y R² 0.664. En la validación agrupada por municipio da RMSE 0.574 frente a 0.708 del kNN puro: las variables satelitales, climáticas y de relieve sí ayudan cuando hay que extrapolar a municipios no vistos. Por estado, el RMSE es 0.357 en Hidalgo, 0.375 en Tlaxcala y 0.578 en Puebla, donde el rendimiento es más alto y más variable (≈4.5 ± 0.5 t/ha): el modelo acierta el nivel de cada zona, pero explica poco de la variación dentro de Puebla. Las 59 predicciones tienen promedio 3.95 t/ha y van de 2.88 a 4.65, en línea con el entrenamiento: 4.47 en Puebla, 3.79 en Hidalgo y 3.00 en Tlaxcala. Frente al Ridge provisional de nueve variables (0.551) la mejora es de 0.06 t/ha; frente al promedio, 0.36.</w:t>
+        <w:t xml:space="preserve"> El ensamble LightGBM (ubicación, relieve, clima) + Random Forest (ubicación, fenología Planet, clima, relieve) obtiene RMSE 0.491 ± 0.007, MAE 0.336 y R² 0.664. En la validación agrupada por municipio da RMSE 0.574 frente a 0.708 del kNN puro: las variables satelitales, climáticas y de relieve sí mejoran la extrapolación a municipios no vistos. Por estado, el RMSE es 0.357 en Hidalgo, 0.375 en Tlaxcala y 0.578 en Puebla, donde el rendimiento es más alto y más variable (≈4.5 ± 0.5 t/ha): el modelo acierta el nivel de cada zona, pero explica poco de la variación dentro de Puebla. Las 59 predicciones tienen promedio 3.95 t/ha y van de 2.88 a 4.65, en línea con el entrenamiento: 4.47 en Puebla, 3.79 en Hidalgo y 3.00 en Tlaxcala. Frente al Ridge provisional de nueve variables (0.551) la mejora es de 0.06 t/ha; frente al promedio, 0.36.</w:t>
       </w:r>
     </w:p>
     <w:p>
@@ -573,7 +573,7 @@
         <w:rPr>
           <w:rFonts w:ascii="Calibri" w:cs="Calibri" w:eastAsia="Calibri" w:hAnsi="Calibri"/>
         </w:rPr>
-        <w:t xml:space="preserve"> Ubicación + relieve + clima + fenología de Planet (RMSE 0.494 en la ablación), seguida de ubicación + relieve (0.496); la mejor sin ubicación es índices + clima + relieve (0.538) y la peor, solo relieve (0.754). Sumar Sentinel-2 a Planet no mejora (0.507–0.520): ven la misma fenología y Planet, casi diario, la describe mejor. La mejor combinación es poca información complementaria: la ubicación da el nivel, relieve y clima afinan la zona, la fenología explica diferencias dentro de ella.</w:t>
+        <w:t xml:space="preserve"> Ubicación + relieve + clima + fenología de Planet (RMSE 0.494 en la ablación), seguida de ubicación + relieve (0.496); la mejor sin ubicación es índices + clima + relieve (0.538) y la peor, solo relieve (0.754). Sumar Sentinel-2 a Planet no mejora (0.507–0.520): ambos sensores capturan la misma fenología y Planet, casi diario, la describe mejor. La combinación óptima reúne información complementaria: la ubicación fija el nivel, relieve y clima afinan la zona y la fenología explica diferencias dentro de ella.</w:t>
       </w:r>
     </w:p>
     <w:p>
@@ -622,19 +622,19 @@
         <w:rPr>
           <w:rFonts w:ascii="Calibri" w:cs="Calibri" w:eastAsia="Calibri" w:hAnsi="Calibri"/>
         </w:rPr>
-        <w:t xml:space="preserve">Hoy el crédito de avío a pequeños productores de cebada se decide con información desigual: el intermediario financiero conoce el historial del productor, si lo hay, pero no el potencial productivo de la parcela concreta que respaldará el pago. CebadaVision convierte datos públicos —imágenes satelitales, clima, relieve y la ubicación de la parcela— en una estimación de rendimiento por parcela con error conocido, sin visita de campo y actualizable cada ciclo. Eso cambia tres decisiones.</w:t>
-      </w:r>
-    </w:p>
-    <w:p>
-      <w:pPr>
-        <w:spacing w:after="140" w:line="288"/>
-        <w:jc w:val="both"/>
-      </w:pPr>
-      <w:r>
-        <w:rPr>
-          <w:rFonts w:ascii="Calibri" w:cs="Calibri" w:eastAsia="Calibri" w:hAnsi="Calibri"/>
-        </w:rPr>
-        <w:t xml:space="preserve">Primera, el tamaño del crédito. Con rendimiento esperado, superficie y precio de referencia se obtiene el valor esperado de la cosecha y, con el rango del modelo, un escenario conservador; el monto de avío puede ajustarse a lo que esa parcela puede pagar, no a un promedio regional. La aplicación muestra la producción estimada en toneladas y un semáforo bajo/medio/alto por terciles, pensado como primer filtro de riesgo.</w:t>
+        <w:t xml:space="preserve">Actualmente el crédito de avío a pequeños productores de cebada se decide con información asimétrica: el intermediario financiero conoce el historial del productor, si lo hay, pero no el potencial productivo de la parcela concreta que respaldará el pago. CebadaVision convierte datos públicos —imágenes satelitales, clima, relieve y la ubicación de la parcela— en una estimación de rendimiento por parcela con error conocido, sin visita de campo y actualizable cada ciclo. Eso cambia tres decisiones.</w:t>
+      </w:r>
+    </w:p>
+    <w:p>
+      <w:pPr>
+        <w:spacing w:after="140" w:line="288"/>
+        <w:jc w:val="both"/>
+      </w:pPr>
+      <w:r>
+        <w:rPr>
+          <w:rFonts w:ascii="Calibri" w:cs="Calibri" w:eastAsia="Calibri" w:hAnsi="Calibri"/>
+        </w:rPr>
+        <w:t xml:space="preserve">Primera, el dimensionamiento del crédito. Con rendimiento esperado, superficie y precio de referencia se obtiene el valor esperado de la cosecha y, con el rango del modelo, un escenario conservador; el monto de avío puede ajustarse a lo que esa parcela puede pagar, no a un promedio regional. La aplicación muestra la producción estimada en toneladas y un semáforo bajo/medio/alto por terciles, pensado como primer filtro de riesgo.</w:t>
       </w:r>
     </w:p>
     <w:p>
@@ -699,7 +699,7 @@
         <w:rPr>
           <w:rFonts w:ascii="Calibri" w:cs="Calibri" w:eastAsia="Calibri" w:hAnsi="Calibri"/>
         </w:rPr>
-        <w:t xml:space="preserve">Construimos un modelo reproducible que predice el rendimiento de grano de parcelas de cebada de temporal en Hidalgo, Tlaxcala y Puebla con RMSE de 0.491 ± 0.007 t/ha, MAE de 0.336 y R² de 0.664 en validación cruzada estratificada por estado y repetida diez veces, frente a 0.851 del promedio regional y 0.501 de un kNN espacial. El modelo final es un ensamble de LightGBM y Random Forest sobre ubicación, relieve, clima y fenología de Planet, y entrega las 59 predicciones solicitadas con promedio de 3.95 t/ha y un rango al 80 % de ±0.63 t/ha.</w:t>
+        <w:t xml:space="preserve">Se construyó un modelo reproducible que predice el rendimiento de grano de parcelas de cebada de temporal en Hidalgo, Tlaxcala y Puebla con RMSE de 0.491 ± 0.007 t/ha, MAE de 0.336 y R² de 0.664 en validación cruzada estratificada por estado y repetida diez veces, frente a 0.851 del promedio regional y 0.501 de un kNN espacial. El modelo final es un ensamble de LightGBM y Random Forest sobre ubicación, relieve, clima y fenología de Planet, y entrega las 59 predicciones solicitadas con promedio de 3.95 t/ha y un rango al 80 % de ±0.63 t/ha.</w:t>
       </w:r>
     </w:p>
     <w:p>

</xml_diff>

<commit_message>
docs(entrega): Metodologia bajo 700 palabras (conteo de Word)
</commit_message>
<xml_diff>
--- a/reports/entrega/01_Informe_CebadaVision.docx
+++ b/reports/entrega/01_Informe_CebadaVision.docx
@@ -316,7 +316,7 @@
         <w:rPr>
           <w:rFonts w:ascii="Calibri" w:cs="Calibri" w:eastAsia="Calibri" w:hAnsi="Calibri"/>
         </w:rPr>
-        <w:t xml:space="preserve"> Se utilizó únicamente el dataset oficial: 197 polígonos (138 de entrenamiento y 59 por predecir), 47 804 observaciones de Planet (NDVI, EVI, LAI, MSAVI) de 2025, 107 666 de Sentinel-2 y Landsat de 2022 a 2025 (22 índices), rásteres mensuales de precipitación (CHIRPS) y de temperatura mínima y máxima a unos 5 km, y elevación y pendiente del Continuo de Elevaciones Mexicano. Una auditoría confirmó 197 identificadores únicos en todas las fuentes, la unión sin pérdidas entre shapefile y tablas, y el reparto 138/59. Se trabajó con el ciclo abril–octubre de 2025 (más noviembre, para capturar la senescencia). Las observaciones con nubosidad del 100 % se descartaron porque traen los índices vacíos; no se imputó ninguna. Landsat no aporta índices en 2025.</w:t>
+        <w:t xml:space="preserve"> Se utilizó únicamente el dataset oficial: 197 polígonos (138 de entrenamiento y 59 por predecir), 47 804 observaciones de Planet (NDVI, EVI, LAI, MSAVI) de 2025, 107 666 de Sentinel-2 y Landsat de 2022 a 2025 (22 índices), rásteres mensuales de precipitación (CHIRPS) y de temperatura mínima y máxima a unos 5 km, y elevación y pendiente del Continuo de Elevaciones Mexicano. Una auditoría confirmó 197 identificadores únicos en todas las fuentes, la unión sin pérdidas y el reparto 138/59. Se trabajó con el ciclo abril–octubre de 2025 (más noviembre, para capturar la senescencia). Las observaciones con nubosidad del 100 % se descartaron porque traen los índices vacíos; no se imputó ninguna. Landsat no aporta índices en 2025.</w:t>
       </w:r>
     </w:p>
     <w:p>
@@ -376,7 +376,7 @@
         <w:rPr>
           <w:rFonts w:ascii="Calibri" w:cs="Calibri" w:eastAsia="Calibri" w:hAnsi="Calibri"/>
         </w:rPr>
-        <w:t xml:space="preserve"> Se compararon regresión ridge, Random Forest (400 árboles, hoja mínima de 3, 33 % de variables por partición), un LightGBM pequeño (300 árboles, tasa 0.03, 7 hojas, submuestreo, regularización L2) y un proceso gaussiano con núcleo RBF más ruido; los faltantes se rellenan con la mediana de entrenamiento dentro de cada ajuste. El banco de experimentos evaluó cada grupo de variables por separado, la ubicación más cada grupo, combinaciones completas y ensambles por promedio. Para las preguntas guía se evaluó cada índice con sus variables fenológicas y cada variable climática, solos y con la ubicación fija, y se calcularon la importancia por permutación del modelo final (aumento del RMSE al barajar cada variable) y una ablación por grupos.</w:t>
+        <w:t xml:space="preserve"> Se compararon regresión ridge, Random Forest (400 árboles, hoja mínima de 3, 33 % de variables por partición), un LightGBM pequeño (300 árboles, tasa 0.03, 7 hojas, submuestreo, regularización L2) y un proceso gaussiano con núcleo RBF más ruido; los faltantes se rellenan con la mediana de entrenamiento dentro de cada ajuste. El banco de experimentos evaluó cada grupo de variables por separado, la ubicación más cada grupo, combinaciones completas y ensambles. Para las preguntas guía se evaluó cada índice con sus variables fenológicas y cada variable climática, solos y con la ubicación fija, y se calcularon la importancia por permutación del modelo final (aumento del RMSE al barajar cada variable) y una ablación por grupos.</w:t>
       </w:r>
     </w:p>
     <w:p>
@@ -396,7 +396,7 @@
         <w:rPr>
           <w:rFonts w:ascii="Calibri" w:cs="Calibri" w:eastAsia="Calibri" w:hAnsi="Calibri"/>
         </w:rPr>
-        <w:t xml:space="preserve"> Es el promedio de dos modelos: LightGBM con ubicación, relieve y clima (11 variables) y Random Forest con ubicación, fenología de Planet, clima y relieve (91 variables). La predicción se recorta al rango plausible de 1.5 a 6.5 t/ha. El rango de predicción al 80 % se calcula como ±1.28 veces el RMSE de validación. Para explicar cada predicción en la aplicación se calculan valores SHAP (Lundberg y Lee, 2017) promediados entre ambos modelos y agrupados por tipo de variable; con ellos la ficha de cada parcela indica qué factores subieron o bajaron su estimación. Para que la aplicación ejecute el modelo en el navegador se ajustó una regresión ridge sustituta sobre 11 variables y se reporta cuánto difiere del ensamble.</w:t>
+        <w:t xml:space="preserve"> Promedio de dos modelos: LightGBM con ubicación, relieve y clima (11 variables) y Random Forest con ubicación, fenología de Planet, clima y relieve (91 variables). La predicción se recorta al rango plausible de 1.5 a 6.5 t/ha; el rango de predicción al 80 % es ±1.28 veces el RMSE de validación. Para explicar cada predicción en la aplicación se calculan valores SHAP (Lundberg y Lee, 2017) promediados entre ambos modelos y agrupados por tipo de variable; con ellos la ficha de cada parcela indica qué factores subieron o bajaron su estimación. Para que la aplicación ejecute el modelo en el navegador se ajustó una regresión ridge sustituta sobre 11 variables y se reporta cuánto difiere del ensamble.</w:t>
       </w:r>
     </w:p>
     <w:p>
@@ -416,7 +416,7 @@
         <w:rPr>
           <w:rFonts w:ascii="Calibri" w:cs="Calibri" w:eastAsia="Calibri" w:hAnsi="Calibri"/>
         </w:rPr>
-        <w:t xml:space="preserve"> Python 3.13 (pandas, geopandas, rasterio, scikit-learn, LightGBM, SHAP); aplicación en React, TypeScript, Leaflet y Recharts; scripts documentados en el README.</w:t>
+        <w:t xml:space="preserve"> Python 3.13 (pandas, geopandas, rasterio, scikit-learn, LightGBM, SHAP); aplicación en React, TypeScript, Leaflet y Recharts.</w:t>
       </w:r>
     </w:p>
     <w:p>

</xml_diff>

<commit_message>
docs: integra el borrador del equipo en Introduccion, Justificacion y Objetivos; actualiza anexos, bibliografia y guias
</commit_message>
<xml_diff>
--- a/reports/entrega/01_Informe_CebadaVision.docx
+++ b/reports/entrega/01_Informe_CebadaVision.docx
@@ -57,31 +57,31 @@
         <w:rPr>
           <w:rFonts w:ascii="Calibri" w:cs="Calibri" w:eastAsia="Calibri" w:hAnsi="Calibri"/>
         </w:rPr>
-        <w:t xml:space="preserve">La cebada es uno de los cultivos más importantes del Altiplano central de México y la materia prima de la industria cervecera. Cerca de tres cuartas partes de la superficie nacional se siembra en esta región, casi toda de temporal, y Hidalgo, Puebla y Tlaxcala concentran la mayor parte de la producción (SIAP, 2023). Quienes la cultivan son, en su mayoría, pequeños y medianos productores que venden su cosecha a comercializadoras y parafinancieras. Para ellos, el rendimiento por hectárea define al mismo tiempo cuánto ganan y si podrán pagar el crédito de avío con el que financiaron el ciclo.</w:t>
-      </w:r>
-    </w:p>
-    <w:p>
-      <w:pPr>
-        <w:spacing w:after="140" w:line="288"/>
-        <w:jc w:val="both"/>
-      </w:pPr>
-      <w:r>
-        <w:rPr>
-          <w:rFonts w:ascii="Calibri" w:cs="Calibri" w:eastAsia="Calibri" w:hAnsi="Calibri"/>
-        </w:rPr>
-        <w:t xml:space="preserve">Estimar el rendimiento de una parcela sin visitarla, y hacerlo para todas las parcelas de una región, es un problema abierto con valor público directo. Los satélites lo hacen posible: Sentinel-2 pasa cada cinco días con píxeles de 10 m y constelaciones como Planet observan casi a diario con píxeles de 3 m. Los estudios recientes muestran que los modelos de aprendizaje automático que combinan estas series con clima y relieve explican buena parte de la variación del rendimiento en cultivos de temporal (van Klompenburg et al., 2020; de la Fuente et al., 2023), aunque su desempeño depende de cuántas parcelas se tengan, de qué tan confiable sea el dato de rendimiento y de cómo estén repartidas.</w:t>
-      </w:r>
-    </w:p>
-    <w:p>
-      <w:pPr>
-        <w:spacing w:after="140" w:line="288"/>
-        <w:jc w:val="both"/>
-      </w:pPr>
-      <w:r>
-        <w:rPr>
-          <w:rFonts w:ascii="Calibri" w:cs="Calibri" w:eastAsia="Calibri" w:hAnsi="Calibri"/>
-        </w:rPr>
-        <w:t xml:space="preserve">El Reto AgroCebada 2026 plantea exactamente ese problema con datos reales: 197 parcelas de cebada de temporal del ciclo abril–octubre de 2025 en Hidalgo, Tlaxcala y Puebla, con índices de vegetación de Sentinel-2, Landsat y Planet, precipitación y temperatura mensuales, elevación y pendiente. El rendimiento de grano (toneladas por hectárea) se conoce para 138 parcelas; el de las otras 59 lo resguarda el comité para calificar las predicciones. Ese rendimiento proviene, en la mayoría de los casos, del registro de compra de la comercializadora y no de una medición en campo, por lo que contiene ruido y, en algunas zonas, está redondeado a medias toneladas.</w:t>
+        <w:t xml:space="preserve">La cebada es uno de los cultivos más importantes del sector agroindustrial: es fundamental para la industria maltera y cervecera y un insumo clave para alimentos y ganado. Todo ese sistema depende de la predictibilidad: el rendimiento por hectárea y la calidad del grano determinan la logística, los precios y la operación de la industria. En México, cerca de tres cuartas partes de la superficie se siembra en el Altiplano central, casi toda de temporal, y Hidalgo, Puebla y Tlaxcala concentran la mayor parte de la producción (SIAP, 2023), en manos de pequeños y medianos productores que venden su cosecha a comercializadoras y parafinancieras.</w:t>
+      </w:r>
+    </w:p>
+    <w:p>
+      <w:pPr>
+        <w:spacing w:after="140" w:line="288"/>
+        <w:jc w:val="both"/>
+      </w:pPr>
+      <w:r>
+        <w:rPr>
+          <w:rFonts w:ascii="Calibri" w:cs="Calibri" w:eastAsia="Calibri" w:hAnsi="Calibri"/>
+        </w:rPr>
+        <w:t xml:space="preserve">El cultivo enfrenta desafíos crecientes: el cambio climático altera los patrones de lluvia y temperatura, las plagas son menos predecibles y los insumos se encarecen. El entorno es especialmente difícil para los pequeños productores, que carecen de herramientas para monitorear sus cultivos de forma continua y toman decisiones reactivas. Ante ello, la combinación de imágenes satelitales, datos climáticos y aprendizaje automático permite convertir información compleja en decisiones claras: Sentinel-2 observa cada cinco días a 10 m, Planet casi a diario a 3 m, y los modelos que combinan estas series con clima y relieve explican buena parte de la variación del rendimiento en cultivos de temporal (van Klompenburg et al., 2020; de la Fuente et al., 2023).</w:t>
+      </w:r>
+    </w:p>
+    <w:p>
+      <w:pPr>
+        <w:spacing w:after="140" w:line="288"/>
+        <w:jc w:val="both"/>
+      </w:pPr>
+      <w:r>
+        <w:rPr>
+          <w:rFonts w:ascii="Calibri" w:cs="Calibri" w:eastAsia="Calibri" w:hAnsi="Calibri"/>
+        </w:rPr>
+        <w:t xml:space="preserve">El Reto AgroCebada 2026 plantea ese problema con datos reales: 197 parcelas de cebada de temporal del ciclo abril–octubre de 2025 en Hidalgo, Tlaxcala y Puebla, con índices de vegetación de Sentinel-2, Landsat y Planet, precipitación y temperatura mensuales, elevación y pendiente. El rendimiento de grano (toneladas por hectárea) se conoce para 138 parcelas; el de las otras 59 lo resguarda el comité para calificar las predicciones. Ese rendimiento proviene, en la mayoría de los casos, del registro de compra de la comercializadora y no de una medición en campo, por lo que contiene ruido y, en algunas zonas, está redondeado a medias toneladas.</w:t>
       </w:r>
     </w:p>
     <w:p>
@@ -148,19 +148,19 @@
         <w:rPr>
           <w:rFonts w:ascii="Calibri" w:cs="Calibri" w:eastAsia="Calibri" w:hAnsi="Calibri"/>
         </w:rPr>
-        <w:t xml:space="preserve">FIRA y los intermediarios financieros rurales otorgan crédito de avío a productores de cebada sin una medida objetiva, oportuna y barata del rendimiento que puede dar cada parcela. Esa falta encarece el crédito, deja fuera a quienes no tienen historial y dificulta diseñar seguros ligados a la producción. Un modelo que estime el rendimiento de cualquier parcela georreferenciada a partir de datos satelitales y climáticos públicos, con un error conocido, convierte información que ya existe en un insumo para decidir.</w:t>
-      </w:r>
-    </w:p>
-    <w:p>
-      <w:pPr>
-        <w:spacing w:after="140" w:line="288"/>
-        <w:jc w:val="both"/>
-      </w:pPr>
-      <w:r>
-        <w:rPr>
-          <w:rFonts w:ascii="Calibri" w:cs="Calibri" w:eastAsia="Calibri" w:hAnsi="Calibri"/>
-        </w:rPr>
-        <w:t xml:space="preserve">El reto aporta además un caso poco común: datos reales de 197 parcelas con rendimiento comercial, no datos sintéticos ni de estación experimental. Resolverlo con rigor —validación reproducible, incertidumbre cuantificada y una explicación de cada predicción— es lo que hace creíble la herramienta tanto para el analista de crédito como para el productor, que fue el público prioritario señalado por FIRA en las sesiones de dudas.</w:t>
+        <w:t xml:space="preserve">Los modelos tradicionales de evaluación y financiamiento agrícola dependen de estimaciones basadas en datos históricos y empíricos que no reflejan la realidad actual de cada parcela. Esa falta de información precisa genera incertidumbre y eleva el riesgo percibido; como resultado, los productores tienen dificultades para acceder a créditos justos y seguros adecuados, y quedan expuestos al clima y a otros imprevistos.</w:t>
+      </w:r>
+    </w:p>
+    <w:p>
+      <w:pPr>
+        <w:spacing w:after="140" w:line="288"/>
+        <w:jc w:val="both"/>
+      </w:pPr>
+      <w:r>
+        <w:rPr>
+          <w:rFonts w:ascii="Calibri" w:cs="Calibri" w:eastAsia="Calibri" w:hAnsi="Calibri"/>
+        </w:rPr>
+        <w:t xml:space="preserve">Este proyecto busca transformar esa vulnerabilidad en estabilidad: reducir la incertidumbre sobre el rendimiento con proyecciones basadas en evidencia satelital y climática, no en suposiciones, y con un error cuantificado. Los datos que genera son transparentes y trazables, lo que reduce la desigualdad de información en la cadena de valor y facilita el acceso a servicios financieros y la inversión pública y privada en el sector. El reto aporta además un caso poco común: datos reales de 197 parcelas con rendimiento comercial, no sintéticos. Resolverlo con rigor —validación reproducible y explicación de cada predicción— es lo que hace creíble la herramienta para el analista de crédito y para el productor, público prioritario según FIRA.</w:t>
       </w:r>
     </w:p>
     <w:p>
@@ -197,7 +197,7 @@
         <w:rPr>
           <w:rFonts w:ascii="Calibri" w:cs="Calibri" w:eastAsia="Calibri" w:hAnsi="Calibri"/>
         </w:rPr>
-        <w:t xml:space="preserve"> Predecir el rendimiento de grano (t/ha) de parcelas de cebada de temporal del ciclo abril–octubre de 2025 en Hidalgo, Tlaxcala y Puebla, a partir de índices de vegetación satelitales, clima, relieve y ubicación, y entregar las predicciones de las 59 parcelas sin dato con un error cuantificado.</w:t>
+        <w:t xml:space="preserve"> Predecir el rendimiento de grano (t/ha) de parcelas de cebada de temporal del ciclo abril–octubre de 2025 en Hidalgo, Tlaxcala y Puebla a partir de índices de vegetación satelitales, clima, relieve y ubicación, y entregar las predicciones de las 59 parcelas sin dato.</w:t>
       </w:r>
     </w:p>
     <w:p>
@@ -228,7 +228,7 @@
         <w:rPr>
           <w:rFonts w:ascii="Calibri" w:cs="Calibri" w:eastAsia="Calibri" w:hAnsi="Calibri"/>
         </w:rPr>
-        <w:t xml:space="preserve">Construir una tabla reproducible de variables por parcela que resuma la fenología de los índices de Planet y Sentinel-2 (valores por mes, emergencia, máximo, duración, velocidad de secado), el clima del ciclo, el relieve y la ubicación.</w:t>
+        <w:t xml:space="preserve">Recopilar, auditar y limpiar datos de varias fuentes —índices de vegetación de Planet y Sentinel-2, clima, relieve y registros espaciales— para construir un conjunto reproducible de variables por parcela con la fenología de cada índice.</w:t>
       </w:r>
     </w:p>
     <w:p>
@@ -245,7 +245,7 @@
         <w:rPr>
           <w:rFonts w:ascii="Calibri" w:cs="Calibri" w:eastAsia="Calibri" w:hAnsi="Calibri"/>
         </w:rPr>
-        <w:t xml:space="preserve">Comparar modelos (Ridge, Random Forest, LightGBM, proceso gaussiano y ensambles) con un mismo esquema de validación cruzada repetida y estratificada por estado, más una validación agrupada por municipio, usando como referencia el promedio regional (RMSE 0.851) y un kNN espacial.</w:t>
+        <w:t xml:space="preserve">Crear y probar modelos de aprendizaje automático (Ridge, Random Forest, LightGBM, proceso gaussiano y ensambles) que predigan la cosecha de cada terreno, comparados con un mismo esquema de validación cruzada repetida y estratificada por estado, con RMSE, MAE y R² frente al promedio regional (RMSE 0.851) y a un kNN espacial.</w:t>
       </w:r>
     </w:p>
     <w:p>
@@ -279,7 +279,7 @@
         <w:rPr>
           <w:rFonts w:ascii="Calibri" w:cs="Calibri" w:eastAsia="Calibri" w:hAnsi="Calibri"/>
         </w:rPr>
-        <w:t xml:space="preserve">Poner el modelo al alcance de analistas y productores en una aplicación web que lo ejecute, muestre mapa, rango de predicción y una explicación sencilla por parcela, y discutir su uso en inclusión financiera.</w:t>
+        <w:t xml:space="preserve">Diseñar y poner en funcionamiento una aplicación interactiva que incluya el modelo y muestre las predicciones en un mapa con su rango y una explicación sencilla por parcela; discutir su uso en inclusión financiera.</w:t>
       </w:r>
     </w:p>
     <w:p>
@@ -513,7 +513,7 @@
         <w:rPr>
           <w:rFonts w:ascii="Calibri" w:cs="Calibri" w:eastAsia="Calibri" w:hAnsi="Calibri"/>
         </w:rPr>
-        <w:t xml:space="preserve"> El ensamble LightGBM (ubicación, relieve, clima) + Random Forest (ubicación, fenología Planet, clima, relieve) obtiene RMSE 0.491 ± 0.007, MAE 0.336 y R² 0.664. En la validación agrupada por municipio da RMSE 0.574 frente a 0.708 del kNN puro: las variables satelitales, climáticas y de relieve sí mejoran la extrapolación a municipios no vistos. Por estado, el RMSE es 0.357 en Hidalgo, 0.375 en Tlaxcala y 0.578 en Puebla, donde el rendimiento es más alto y más variable (≈4.5 ± 0.5 t/ha): el modelo acierta el nivel de cada zona, pero explica poco de la variación dentro de Puebla. Las 59 predicciones tienen promedio 3.95 t/ha y van de 2.88 a 4.65, en línea con el entrenamiento: 4.47 en Puebla, 3.79 en Hidalgo y 3.00 en Tlaxcala. Frente al Ridge provisional de nueve variables (0.551) la mejora es de 0.06 t/ha; frente al promedio, 0.36.</w:t>
+        <w:t xml:space="preserve"> El ensamble LightGBM (ubicación, relieve, clima) + Random Forest (ubicación, fenología Planet, clima, relieve) obtiene RMSE 0.491 ± 0.007, MAE 0.336 y R² 0.664. En la validación agrupada por municipio da RMSE 0.574 frente a 0.708 del kNN puro: las variables satelitales, climáticas y de relieve sí mejoran la extrapolación a municipios no vistos. Por estado, el RMSE es 0.357 en Hidalgo, 0.375 en Tlaxcala y 0.578 en Puebla, donde el rendimiento es más alto y más variable (≈4.5 ± 0.5 t/ha): el modelo acierta el nivel de cada zona, pero explica poco de la variación dentro de Puebla. Las 59 predicciones tienen promedio 3.95 t/ha y van de 2.88 a 4.65, en línea con el entrenamiento: 4.47 en Puebla, 3.79 en Hidalgo y 3.00 en Tlaxcala. Frente al Ridge provisional de nueve variables (0.551) la mejora es de 0.06 t/ha; frente al promedio, 0.36. Un Random Forest del equipo con clima y municipio/estado codificados (one-hot), con particiones propias, obtuvo 0.513 ± 0.087 (MAE 0.363, R² 0.621), coherente con el predominio de la zona.</w:t>
       </w:r>
     </w:p>
     <w:p>

</xml_diff>

<commit_message>
docs: precisa alcance científico y prepara revisión documental FIRA
</commit_message>
<xml_diff>
--- a/reports/entrega/01_Informe_CebadaVision.docx
+++ b/reports/entrega/01_Informe_CebadaVision.docx
@@ -5,7 +5,7 @@
     <w:p>
       <w:pPr>
         <w:pStyle w:val="Title"/>
-        <w:spacing w:before="280" w:after="120"/>
+        <w:spacing w:after="120" w:before="280"/>
       </w:pPr>
       <w:r>
         <w:rPr>
@@ -34,7 +34,7 @@
     <w:p>
       <w:pPr>
         <w:pStyle w:val="Heading1"/>
-        <w:spacing w:before="280" w:after="120"/>
+        <w:spacing w:after="120" w:before="280"/>
       </w:pPr>
       <w:r>
         <w:rPr>
@@ -57,43 +57,43 @@
         <w:rPr>
           <w:rFonts w:ascii="Calibri" w:cs="Calibri" w:eastAsia="Calibri" w:hAnsi="Calibri"/>
         </w:rPr>
-        <w:t xml:space="preserve">La cebada es uno de los cultivos más importantes del sector agroindustrial: es fundamental para la industria maltera y cervecera y un insumo clave para alimentos y ganado. Todo ese sistema depende de la predictibilidad: el rendimiento por hectárea y la calidad del grano determinan la logística, los precios y la operación de la industria. En México, cerca de tres cuartas partes de la superficie se siembra en el Altiplano central, casi toda de temporal, y Hidalgo, Puebla y Tlaxcala concentran la mayor parte de la producción (SIAP, 2023), en manos de pequeños y medianos productores que venden su cosecha a comercializadoras y parafinancieras.</w:t>
-      </w:r>
-    </w:p>
-    <w:p>
-      <w:pPr>
-        <w:spacing w:after="140" w:line="288"/>
-        <w:jc w:val="both"/>
-      </w:pPr>
-      <w:r>
-        <w:rPr>
-          <w:rFonts w:ascii="Calibri" w:cs="Calibri" w:eastAsia="Calibri" w:hAnsi="Calibri"/>
-        </w:rPr>
-        <w:t xml:space="preserve">El cultivo enfrenta desafíos crecientes: el cambio climático altera los patrones de lluvia y temperatura, las plagas son menos predecibles y los insumos se encarecen. El entorno es especialmente difícil para los pequeños productores, que carecen de herramientas para monitorear sus cultivos de forma continua y toman decisiones reactivas. Ante ello, la combinación de imágenes satelitales, datos climáticos y aprendizaje automático permite convertir información compleja en decisiones claras: Sentinel-2 observa cada cinco días a 10 m, Planet casi a diario a 3 m, y los modelos que combinan estas series con clima y relieve explican buena parte de la variación del rendimiento en cultivos de temporal (van Klompenburg et al., 2020; de la Fuente et al., 2023).</w:t>
-      </w:r>
-    </w:p>
-    <w:p>
-      <w:pPr>
-        <w:spacing w:after="140" w:line="288"/>
-        <w:jc w:val="both"/>
-      </w:pPr>
-      <w:r>
-        <w:rPr>
-          <w:rFonts w:ascii="Calibri" w:cs="Calibri" w:eastAsia="Calibri" w:hAnsi="Calibri"/>
-        </w:rPr>
-        <w:t xml:space="preserve">El Reto AgroCebada 2026 plantea ese problema con datos reales: 197 parcelas de cebada de temporal del ciclo abril–octubre de 2025 en Hidalgo, Tlaxcala y Puebla, con índices de vegetación de Sentinel-2, Landsat y Planet, precipitación y temperatura mensuales, elevación y pendiente. El rendimiento de grano (toneladas por hectárea) se conoce para 138 parcelas; el de las otras 59 lo resguarda el comité para calificar las predicciones. Ese rendimiento proviene, en la mayoría de los casos, del registro de compra de la comercializadora y no de una medición en campo, por lo que contiene ruido y, en algunas zonas, está redondeado a medias toneladas.</w:t>
-      </w:r>
-    </w:p>
-    <w:p>
-      <w:pPr>
-        <w:spacing w:after="140" w:line="288"/>
-        <w:jc w:val="both"/>
-      </w:pPr>
-      <w:r>
-        <w:rPr>
-          <w:rFonts w:ascii="Calibri" w:cs="Calibri" w:eastAsia="Calibri" w:hAnsi="Calibri"/>
-        </w:rPr>
-        <w:t xml:space="preserve">Este trabajo presenta CebadaVision, una solución con tres partes. Primero, una tabla de variables por parcela que resume cómo se comportó cada índice durante el ciclo (cuándo emergió el cultivo, cuánto verdor alcanzó, cuánto duró verde y qué tan rápido se secó), más clima, relieve y ubicación. Segundo, un modelo que promedia dos algoritmos de árboles (LightGBM y Random Forest), validado con un esquema repetido y estratificado por estado, que alcanza un error (RMSE) de 0.49 t/ha frente a 0.85 t/ha de predecir el promedio regional. Tercero, una aplicación web que ejecuta el modelo, muestra las 197 parcelas en un mapa, entrega la estimación con su rango y explica con palabras sencillas cómo se llegó a cada número.</w:t>
+        <w:t xml:space="preserve">La cebada es uno de los cultivos más importantes del sector agroindustrial: es fundamental para la industria maltera y cervecera y un insumo clave para alimentos y ganado. El rendimiento por hectárea y la calidad del grano determinan la logística, los precios y la operación de la industria. En México, cerca de tres cuartas partes de la superficie se siembra en el Altiplano central, casi toda de temporal, y Hidalgo, Puebla y Tlaxcala concentran la mayor parte de la producción (SIAP, 2023), en manos de pequeños y medianos productores que venden su cosecha a comercializadoras y parafinancieras.</w:t>
+      </w:r>
+    </w:p>
+    <w:p>
+      <w:pPr>
+        <w:spacing w:after="140" w:line="288"/>
+        <w:jc w:val="both"/>
+      </w:pPr>
+      <w:r>
+        <w:rPr>
+          <w:rFonts w:ascii="Calibri" w:cs="Calibri" w:eastAsia="Calibri" w:hAnsi="Calibri"/>
+        </w:rPr>
+        <w:t xml:space="preserve">El cultivo enfrenta desafíos crecientes: el cambio climático altera los patrones de lluvia y temperatura, las plagas son menos predecibles y los insumos se encarecen. Para los pequeños productores, el monitoreo continuo es difícil. Las imágenes satelitales, los datos climáticos y el aprendizaje automático permiten estudiar el rendimiento: Sentinel-2 observa cada cinco días a 10 m, Planet casi a diario a 3 m, y los modelos que combinan estas series con clima y relieve explican buena parte de la variación del rendimiento en cultivos de temporal (van Klompenburg et al., 2020; de la Fuente et al., 2023).</w:t>
+      </w:r>
+    </w:p>
+    <w:p>
+      <w:pPr>
+        <w:spacing w:after="140" w:line="288"/>
+        <w:jc w:val="both"/>
+      </w:pPr>
+      <w:r>
+        <w:rPr>
+          <w:rFonts w:ascii="Calibri" w:cs="Calibri" w:eastAsia="Calibri" w:hAnsi="Calibri"/>
+        </w:rPr>
+        <w:t xml:space="preserve">El Reto AgroCebada 2026 plantea ese problema con datos reales: 197 parcelas de cebada de temporal del ciclo abril–octubre de 2025 en Hidalgo, Tlaxcala y Puebla, con índices de vegetación de Sentinel-2, Landsat y Planet, precipitación y temperatura mensuales, elevación y pendiente. El rendimiento de grano (toneladas por hectárea) se conoce para 138 parcelas; el de las otras 59 lo resguarda el comité para calificar las predicciones. Según la aclaración de FIRA, el rendimiento procede del pesaje en báscula de la cosecha de cada parcela, sin ajustes por humedad, impurezas o mermas. En Tlaxcala se observa redondeo a medias toneladas; esto no implica ausencia de medición.</w:t>
+      </w:r>
+    </w:p>
+    <w:p>
+      <w:pPr>
+        <w:spacing w:after="140" w:line="288"/>
+        <w:jc w:val="both"/>
+      </w:pPr>
+      <w:r>
+        <w:rPr>
+          <w:rFonts w:ascii="Calibri" w:cs="Calibri" w:eastAsia="Calibri" w:hAnsi="Calibri"/>
+        </w:rPr>
+        <w:t xml:space="preserve">Este trabajo presenta CebadaVision, una solución con tres partes. Primero, una tabla de variables por parcela que resume cómo se comportó cada índice durante el ciclo (cuándo emergió el cultivo, cuánto verdor alcanzó, cuánto duró verde y qué tan rápido se secó), más clima, relieve y ubicación. Segundo, un modelo que promedia dos algoritmos de árboles (LightGBM y Random Forest), validado con un esquema repetido y estratificado por estado, que alcanza un error (RMSE) de 0.49 t/ha frente a 0.85 t/ha de predecir el promedio regional. Tercero, una aplicación web que muestra las predicciones precalculadas del ensamble para las 197 parcelas, su margen orientativo y explicaciones sencillas; su simulador utiliza una regresión Ridge sustituta.</w:t>
       </w:r>
     </w:p>
     <w:p>
@@ -125,7 +125,7 @@
     <w:p>
       <w:pPr>
         <w:pStyle w:val="Heading1"/>
-        <w:spacing w:before="280" w:after="120"/>
+        <w:spacing w:after="120" w:before="280"/>
       </w:pPr>
       <w:r>
         <w:rPr>
@@ -160,13 +160,13 @@
         <w:rPr>
           <w:rFonts w:ascii="Calibri" w:cs="Calibri" w:eastAsia="Calibri" w:hAnsi="Calibri"/>
         </w:rPr>
-        <w:t xml:space="preserve">Este proyecto busca transformar esa vulnerabilidad en estabilidad: reducir la incertidumbre sobre el rendimiento con proyecciones basadas en evidencia satelital y climática, no en suposiciones, y con un error cuantificado. Los datos que genera son transparentes y trazables, lo que reduce la desigualdad de información en la cadena de valor y facilita el acceso a servicios financieros y la inversión pública y privada en el sector. El reto aporta además un caso poco común: datos reales de 197 parcelas con rendimiento comercial, no sintéticos. Resolverlo con rigor —validación reproducible y explicación de cada predicción— es lo que hace creíble la herramienta para el analista de crédito y para el productor, público prioritario según FIRA.</w:t>
+        <w:t xml:space="preserve">Este proyecto estima retrospectivamente el rendimiento mediante evidencia satelital y climática, con un error medido en validación. La trazabilidad de los datos podría reducir la desigualdad de información en la cadena de valor y apoyar la evaluación financiera, aunque ese beneficio requiere validación operativa. El reto aporta además un caso poco común: datos reales de 197 parcelas y 138 rendimientos conocidos obtenidos por pesaje en báscula. Resolverlo con rigor —validación reproducible y explicación de cada predicción— es lo que hace creíble la herramienta para el analista de crédito y para el productor, público prioritario según FIRA.</w:t>
       </w:r>
     </w:p>
     <w:p>
       <w:pPr>
         <w:pStyle w:val="Heading1"/>
-        <w:spacing w:before="280" w:after="120"/>
+        <w:spacing w:after="120" w:before="280"/>
       </w:pPr>
       <w:r>
         <w:rPr>
@@ -279,13 +279,13 @@
         <w:rPr>
           <w:rFonts w:ascii="Calibri" w:cs="Calibri" w:eastAsia="Calibri" w:hAnsi="Calibri"/>
         </w:rPr>
-        <w:t xml:space="preserve">Diseñar y poner en funcionamiento una aplicación interactiva que incluya el modelo y muestre las predicciones en un mapa con su rango y una explicación sencilla por parcela; discutir su uso en inclusión financiera.</w:t>
+        <w:t xml:space="preserve">Implementar una aplicación que muestre las predicciones precalculadas del ensamble con margen orientativo y explicación por parcela, distinga el simulador Ridge sustituto y discuta su posible uso en inclusión financiera.</w:t>
       </w:r>
     </w:p>
     <w:p>
       <w:pPr>
         <w:pStyle w:val="Heading1"/>
-        <w:spacing w:before="280" w:after="120"/>
+        <w:spacing w:after="120" w:before="280"/>
       </w:pPr>
       <w:r>
         <w:rPr>
@@ -316,7 +316,7 @@
         <w:rPr>
           <w:rFonts w:ascii="Calibri" w:cs="Calibri" w:eastAsia="Calibri" w:hAnsi="Calibri"/>
         </w:rPr>
-        <w:t xml:space="preserve"> Se utilizó únicamente el dataset oficial: 197 polígonos (138 de entrenamiento y 59 por predecir), 47 804 observaciones de Planet (NDVI, EVI, LAI, MSAVI) de 2025, 107 666 de Sentinel-2 y Landsat de 2022 a 2025 (22 índices), rásteres mensuales de precipitación (CHIRPS) y de temperatura mínima y máxima a unos 5 km, y elevación y pendiente del Continuo de Elevaciones Mexicano. Una auditoría confirmó 197 identificadores únicos en todas las fuentes, la unión sin pérdidas y el reparto 138/59. Se trabajó con el ciclo abril–octubre de 2025 (más noviembre, para capturar la senescencia). Las observaciones con nubosidad del 100 % se descartaron porque traen los índices vacíos; no se imputó ninguna. Landsat no aporta índices en 2025.</w:t>
+        <w:t xml:space="preserve"> Se utilizó únicamente el dataset oficial: 197 polígonos (138 de entrenamiento y 59 por predecir), 47 804 observaciones de Planet (NDVI, EVI, LAI, MSAVI) de 2025, 107 666 de Sentinel-2 y Landsat de 2022 a 2025 (22 índices), rásteres mensuales de precipitación (CHIRPS) y de temperatura mínima y máxima a unos 5 km, y elevación y pendiente del Continuo de Elevaciones Mexicano. La auditoría confirmó identificadores únicos, unión sin pérdidas y reparto 138/59. Se trabajó con el ciclo abril–octubre de 2025 (más noviembre, para capturar la senescencia). Las observaciones con nubosidad del 100 % se descartaron porque traen los índices vacíos; no se imputó ninguna. Landsat no aporta índices en 2025.</w:t>
       </w:r>
     </w:p>
     <w:p>
@@ -336,7 +336,7 @@
         <w:rPr>
           <w:rFonts w:ascii="Calibri" w:cs="Calibri" w:eastAsia="Calibri" w:hAnsi="Calibri"/>
         </w:rPr>
-        <w:t xml:space="preserve"> Para cada parcela e índice se tomó la serie del promedio del polígono, se suavizó con una mediana móvil de tres observaciones y se calcularon: mediana de cada mes de abril a noviembre, medianas por ventana (mayo–junio, julio–septiembre, octubre–noviembre), valor y fecha del máximo, amplitud, área bajo la curva de abril a octubre, inicio y fin de la temporada verde (cuando la curva cruza la mitad de su amplitud al subir y al bajar), duración y velocidades de crecimiento y de secado. Resultaron 80 variables de Planet y 160 de Sentinel-2 (NDVI, EVI, SAVI, LAI, fAPAR, NDWI, MSI, NDTI). El clima se resumió en lluvia acumulada abril–octubre, temperaturas mínima y máxima medias del ciclo y anomalía de lluvia respecto al promedio 2022–2024; por la resolución del ráster, estas variables solo toman 25 valores distintos en las 197 parcelas. El relieve aporta elevación media, su variación y pendiente media. La ubicación se representó con las coordenadas del centroide (km), la zona (k-means de tres grupos sobre los centroides, sin usar el rendimiento), el rendimiento promedio de la zona y el promedio ponderado por distancia del rendimiento de las ocho parcelas de entrenamiento más cercanas.</w:t>
+        <w:t xml:space="preserve"> Para cada parcela e índice se tomó la serie del promedio del polígono, se suavizó con una mediana móvil de tres observaciones y se calcularon: mediana de cada mes de abril a noviembre, medianas por ventana (mayo–junio, julio–septiembre, octubre–noviembre), valor y fecha del máximo, amplitud, área bajo la curva de abril a octubre, inicio y fin de la temporada verde (cruce de media amplitud), duración y velocidades de crecimiento y de secado. Resultaron 80 variables de Planet y 160 de Sentinel-2 (NDVI, EVI, SAVI, LAI, fAPAR, NDWI, MSI, NDTI). El clima se resumió en lluvia acumulada abril–octubre, temperaturas mínima y máxima medias del ciclo y anomalía de lluvia respecto al promedio 2022–2024; por la resolución del ráster, estas variables solo toman 25 valores distintos en las 197 parcelas. El relieve aporta elevación media, su variación y pendiente media. La ubicación se representó con las coordenadas del centroide (km), la zona (k-means de tres grupos sobre los centroides, sin usar el rendimiento), el rendimiento promedio de la zona y el promedio ponderado por distancia del rendimiento de las ocho parcelas de entrenamiento más cercanas.</w:t>
       </w:r>
     </w:p>
     <w:p>
@@ -356,7 +356,7 @@
         <w:rPr>
           <w:rFonts w:ascii="Calibri" w:cs="Calibri" w:eastAsia="Calibri" w:hAnsi="Calibri"/>
         </w:rPr>
-        <w:t xml:space="preserve"> La métrica principal es el RMSE (criterio de FIRA), con MAE y R². Se usó validación cruzada de 5 particiones estratificadas por estado —imita el reparto oficial 70/30, proporcional por zona y espacialmente mezclado— repetida 10 veces con semillas distintas; se reporta promedio y desviación entre repeticiones, y se considera ruido cualquier diferencia de RMSE menor a 0.03 t/ha. Como prueba más exigente se añadió una validación agrupada por municipio. Las variables de vecinos y de zona se recalculan dentro de cada partición solo con las parcelas de entrenamiento de esa partición (y sin contar a la propia parcela), de modo que el rendimiento de una parcela nunca entra en sus propias variables ni en las de las parcelas con las que se evalúa.</w:t>
+        <w:t xml:space="preserve"> La métrica principal es el RMSE (criterio de FIRA), con MAE y R². Se usó validación cruzada de 5 particiones estratificadas por estado —mantiene representación estatal, con proporción 80/20 por partición— repetida 10 veces; se reporta promedio y desviación entre repeticiones, y diferencias de RMSE menores a 0.03 t/ha se interpretan con cautela, sin prueba de significancia. Como prueba más exigente se añadió una validación agrupada por municipio. Las variables de vecinos y zona se recalculan dentro de cada partición usando únicamente sus rendimientos de entrenamiento; al construir las variables de una parcela de entrenamiento se excluye su propio rendimiento. Los rendimientos de validación no intervienen.</w:t>
       </w:r>
     </w:p>
     <w:p>
@@ -376,7 +376,7 @@
         <w:rPr>
           <w:rFonts w:ascii="Calibri" w:cs="Calibri" w:eastAsia="Calibri" w:hAnsi="Calibri"/>
         </w:rPr>
-        <w:t xml:space="preserve"> Se compararon regresión ridge, Random Forest (400 árboles, hoja mínima de 3, 33 % de variables por partición), un LightGBM pequeño (300 árboles, tasa 0.03, 7 hojas, submuestreo, regularización L2) y un proceso gaussiano con núcleo RBF más ruido; los faltantes se rellenan con la mediana de entrenamiento dentro de cada ajuste. El banco de experimentos evaluó cada grupo de variables por separado, la ubicación más cada grupo, combinaciones completas y ensambles. Para las preguntas guía se evaluó cada índice con sus variables fenológicas y cada variable climática, solos y con la ubicación fija, y se calcularon la importancia por permutación del modelo final (aumento del RMSE al barajar cada variable) y una ablación por grupos.</w:t>
+        <w:t xml:space="preserve"> Se compararon regresión ridge, Random Forest (400 árboles, hoja mínima de 3, 33 % de variables por partición), un LightGBM pequeño (300 árboles, tasa 0.03, 7 hojas, submuestreo, regularización L2) y un proceso gaussiano con núcleo RBF más ruido; los faltantes se rellenan con la mediana de entrenamiento dentro de cada ajuste. El banco de experimentos evaluó cada grupo de variables por separado, la ubicación más cada grupo, combinaciones completas y ensambles. Para las preguntas guía se evaluó cada índice con sus variables fenológicas y cada variable climática, solos y con la ubicación fija, y se calcularon importancia por permutación sobre entrenamiento (aumento del RMSE al barajar cada variable) y ablación por grupos con tres repeticiones.</w:t>
       </w:r>
     </w:p>
     <w:p>
@@ -396,7 +396,7 @@
         <w:rPr>
           <w:rFonts w:ascii="Calibri" w:cs="Calibri" w:eastAsia="Calibri" w:hAnsi="Calibri"/>
         </w:rPr>
-        <w:t xml:space="preserve"> Promedio de dos modelos: LightGBM con ubicación, relieve y clima (11 variables) y Random Forest con ubicación, fenología de Planet, clima y relieve (91 variables). La predicción se recorta al rango plausible de 1.5 a 6.5 t/ha; el rango de predicción al 80 % es ±1.28 veces el RMSE de validación. Para explicar cada predicción en la aplicación se calculan valores SHAP (Lundberg y Lee, 2017) promediados entre ambos modelos y agrupados por tipo de variable; con ellos la ficha de cada parcela indica qué factores subieron o bajaron su estimación. Para que la aplicación ejecute el modelo en el navegador se ajustó una regresión ridge sustituta sobre 11 variables y se reporta cuánto difiere del ensamble.</w:t>
+        <w:t xml:space="preserve"> Promedio de LightGBM con ubicación, relieve y clima (11 variables) y Random Forest con ubicación, fenología de Planet, clima y relieve (91 variables). La predicción se recorta a 1.5–6.5 t/ha. El margen orientativo es ±1.2816 × RMSE, aproximadamente ±0.63 t/ha; su cobertura del 80 % no está calibrada ni verificada empíricamente. Se calculan valores SHAP (Lundberg y Lee, 2017), promediados entre modelos y agrupados por tipo de variable, para explicar las estimaciones precalculadas que muestran el mapa y las fichas. El navegador ejecuta únicamente el simulador Ridge sustituto de 11 variables, ajustado a las predicciones del ensamble sobre las 197 parcelas. Su discrepancia RMSE de 0.3161 t/ha se mide en esos mismos datos; no es una validación independiente contra rendimientos reales ni evidencia causal.</w:t>
       </w:r>
     </w:p>
     <w:p>
@@ -422,7 +422,7 @@
     <w:p>
       <w:pPr>
         <w:pStyle w:val="Heading1"/>
-        <w:spacing w:before="280" w:after="120"/>
+        <w:spacing w:after="120" w:before="280"/>
       </w:pPr>
       <w:r>
         <w:rPr>
@@ -453,7 +453,7 @@
         <w:rPr>
           <w:rFonts w:ascii="Calibri" w:cs="Calibri" w:eastAsia="Calibri" w:hAnsi="Calibri"/>
         </w:rPr>
-        <w:t xml:space="preserve"> Predecir el promedio de entrenamiento da RMSE 0.851 t/ha (R² −0.02). Un kNN espacial que solo usa las ocho parcelas vecinas baja a 0.501 (R² 0.65): la ubicación por sí sola explica cerca de dos tercios de la variación y es la referencia que cualquier modelo debe superar.</w:t>
+        <w:t xml:space="preserve"> Predecir el promedio de entrenamiento da RMSE 0.851 t/ha (R² −0.02). Un kNN espacial que solo usa las ocho parcelas vecinas baja a 0.501 (R² 0.65): la ubicación por sí sola explica cerca de dos tercios de la variación y constituye la referencia espacial.</w:t>
       </w:r>
     </w:p>
     <w:p>
@@ -493,7 +493,7 @@
         <w:rPr>
           <w:rFonts w:ascii="Calibri" w:cs="Calibri" w:eastAsia="Calibri" w:hAnsi="Calibri"/>
         </w:rPr>
-        <w:t xml:space="preserve"> Sumar a la ubicación los índices de Planet, Sentinel-2 o el clima deja el RMSE entre 0.500 y 0.515; sumar relieve lo lleva a 0.492. Ningún grupo aporta más de 0.01–0.02 t/ha una vez conocida la ubicación: la correlación de cualquier variable satelital con lo que el kNN no explica no pasa de |ρ| = 0.17. Con 138 parcelas y un rendimiento comercial, redondeado a medias toneladas en toda la zona de Tlaxcala, el piso de ruido es alto. Los modelos lineales empeoran al agregar variables (ridge con 251 variables: 0.567); los de árboles se mantienen.</w:t>
+        <w:t xml:space="preserve"> Sumar a la ubicación los índices de Planet, Sentinel-2 o el clima deja el RMSE entre 0.500 y 0.515; sumar relieve lo lleva a 0.492. Ningún grupo aporta más de 0.01–0.02 t/ha una vez conocida la ubicación: la correlación de cualquier variable satelital con lo que el kNN no explica no pasa de |ρ| = 0.17. Las 138 parcelas, el redondeo observado en Tlaxcala y el clima de baja resolución limitan la interpretación de mejoras pequeñas. Los modelos lineales empeoran al agregar variables (ridge con 251 variables: 0.567); los de árboles se mantienen.</w:t>
       </w:r>
     </w:p>
     <w:p>
@@ -513,7 +513,7 @@
         <w:rPr>
           <w:rFonts w:ascii="Calibri" w:cs="Calibri" w:eastAsia="Calibri" w:hAnsi="Calibri"/>
         </w:rPr>
-        <w:t xml:space="preserve"> El ensamble LightGBM (ubicación, relieve, clima) + Random Forest (ubicación, fenología Planet, clima, relieve) obtiene RMSE 0.491 ± 0.007, MAE 0.336 y R² 0.664. En la validación agrupada por municipio da RMSE 0.574 frente a 0.708 del kNN puro: las variables satelitales, climáticas y de relieve sí mejoran la extrapolación a municipios no vistos. Por estado, el RMSE es 0.357 en Hidalgo, 0.375 en Tlaxcala y 0.578 en Puebla, donde el rendimiento es más alto y más variable (≈4.5 ± 0.5 t/ha): el modelo acierta el nivel de cada zona, pero explica poco de la variación dentro de Puebla. Las 59 predicciones tienen promedio 3.95 t/ha y van de 2.88 a 4.65, en línea con el entrenamiento: 4.47 en Puebla, 3.79 en Hidalgo y 3.00 en Tlaxcala. Frente al Ridge provisional de nueve variables (0.551) la mejora es de 0.06 t/ha; frente al promedio, 0.36. Un Random Forest del equipo con clima y municipio/estado codificados (one-hot), con particiones propias, obtuvo 0.513 ± 0.087 (MAE 0.363, R² 0.621), coherente con el predominio de la zona.</w:t>
+        <w:t xml:space="preserve"> El ensamble LightGBM (ubicación, relieve, clima) + Random Forest (ubicación, fenología Planet, clima, relieve) obtiene RMSE 0.491 ± 0.007, MAE 0.336 y R² 0.664. La diferencia frente al kNN es 0.010 t/ha, menor que el umbral orientativo de 0.03: no demuestra superioridad estadística. En validación por municipio obtiene RMSE 0.574 frente a 0.708 del kNN; es evidencia favorable dentro de esta muestra, sin garantizar generalización a otras regiones o ciclos. Por estado (predicciones fuera de fold promediadas), RMSE/R² son 0.357/0.784 en Hidalgo (n=36), 0.578/0.007 en Puebla (n=71) y 0.375/−0.026 en Tlaxcala (n=31). El desempeño global no se reproduce dentro de Puebla y Tlaxcala: se explica muy poca variación interna y, en Tlaxcala, no se supera su media estatal según R². Las 59 predicciones tienen promedio 3.95 t/ha y van de 2.88 a 4.65, en línea con el entrenamiento: 4.47 en Puebla, 3.79 en Hidalgo y 3.00 en Tlaxcala. Frente al Ridge provisional de nueve variables (0.551), la reducción observada es 0.06 t/ha; frente al promedio, 0.36. Aquel Ridge es distinto del sustituto usado por el simulador.</w:t>
       </w:r>
     </w:p>
     <w:p>
@@ -573,7 +573,7 @@
         <w:rPr>
           <w:rFonts w:ascii="Calibri" w:cs="Calibri" w:eastAsia="Calibri" w:hAnsi="Calibri"/>
         </w:rPr>
-        <w:t xml:space="preserve"> Ubicación + relieve + clima + fenología de Planet (RMSE 0.494 en la ablación), seguida de ubicación + relieve (0.496); la mejor sin ubicación es índices + clima + relieve (0.538) y la peor, solo relieve (0.754). Sumar Sentinel-2 a Planet no mejora (0.507–0.520): ambos sensores capturan la misma fenología y Planet, casi diario, la describe mejor. La combinación óptima reúne información complementaria: la ubicación fija el nivel, relieve y clima afinan la zona y la fenología explica diferencias dentro de ella.</w:t>
+        <w:t xml:space="preserve"> Ubicación + relieve + clima + fenología de Planet (RMSE 0.494 en la ablación), seguida de ubicación + relieve (0.496); la mejor sin ubicación es índices + clima + relieve (0.538) y la peor, solo relieve (0.754). Sumar Sentinel-2 a Planet no mejora (0.507–0.520): ambos sensores capturan la misma fenología y Planet, casi diario, la describe mejor. La combinación con menor error observado reúne información complementaria; su ventaja requiere confirmación en muestras independientes.</w:t>
       </w:r>
     </w:p>
     <w:p>
@@ -593,13 +593,13 @@
         <w:rPr>
           <w:rFonts w:ascii="Calibri" w:cs="Calibri" w:eastAsia="Calibri" w:hAnsi="Calibri"/>
         </w:rPr>
-        <w:t xml:space="preserve"> En esta muestra la predicción espacial domina y los índices afinan en el margen; es una limitación del dato (138 parcelas, rendimiento comercial con redondeo, 25 píxeles de clima), no del método. Las predicciones son estables (desviación entre repeticiones de 0.007 t/ha), pero su rango al 80 % es de ±0.63 t/ha, y la aplicación lo muestra junto a cada estimación.</w:t>
+        <w:t xml:space="preserve"> La predicción espacial domina; no puede atribuirse esta limitación exclusivamente al dato o al método. La desviación de 0.007 t/ha describe el RMSE entre repeticiones, no la incertidumbre de cada parcela. El margen ±0.63 t/ha es orientativo: no tiene cobertura del 80 % calibrada. El uso de información hasta noviembre hace retrospectivo este análisis.</w:t>
       </w:r>
     </w:p>
     <w:p>
       <w:pPr>
         <w:pStyle w:val="Heading1"/>
-        <w:spacing w:before="280" w:after="120"/>
+        <w:spacing w:after="120" w:before="280"/>
       </w:pPr>
       <w:r>
         <w:rPr>
@@ -622,61 +622,61 @@
         <w:rPr>
           <w:rFonts w:ascii="Calibri" w:cs="Calibri" w:eastAsia="Calibri" w:hAnsi="Calibri"/>
         </w:rPr>
-        <w:t xml:space="preserve">Actualmente el crédito de avío a pequeños productores de cebada se decide con información asimétrica: el intermediario financiero conoce el historial del productor, si lo hay, pero no el potencial productivo de la parcela concreta que respaldará el pago. CebadaVision convierte datos públicos —imágenes satelitales, clima, relieve y la ubicación de la parcela— en una estimación de rendimiento por parcela con error conocido, sin visita de campo y actualizable cada ciclo. Eso cambia tres decisiones.</w:t>
-      </w:r>
-    </w:p>
-    <w:p>
-      <w:pPr>
-        <w:spacing w:after="140" w:line="288"/>
-        <w:jc w:val="both"/>
-      </w:pPr>
-      <w:r>
-        <w:rPr>
-          <w:rFonts w:ascii="Calibri" w:cs="Calibri" w:eastAsia="Calibri" w:hAnsi="Calibri"/>
-        </w:rPr>
-        <w:t xml:space="preserve">Primera, el dimensionamiento del crédito. Con rendimiento esperado, superficie y precio de referencia se obtiene el valor esperado de la cosecha y, con el rango del modelo, un escenario conservador; el monto de avío puede ajustarse a lo que esa parcela puede pagar, no a un promedio regional. La aplicación muestra la producción estimada en toneladas y un semáforo bajo/medio/alto por terciles, pensado como primer filtro de riesgo.</w:t>
-      </w:r>
-    </w:p>
-    <w:p>
-      <w:pPr>
-        <w:spacing w:after="140" w:line="288"/>
-        <w:jc w:val="both"/>
-      </w:pPr>
-      <w:r>
-        <w:rPr>
-          <w:rFonts w:ascii="Calibri" w:cs="Calibri" w:eastAsia="Calibri" w:hAnsi="Calibri"/>
-        </w:rPr>
-        <w:t xml:space="preserve">Segunda, la inclusión de productores sin historial. Alguien sin expediente crediticio puede ser evaluado por la evidencia objetiva de su parcela y de sus vecinas; la ubicación, que es lo que más pesa en el modelo, es justamente información que el productor no puede alterar y que la financiera no necesita verificar en campo.</w:t>
-      </w:r>
-    </w:p>
-    <w:p>
-      <w:pPr>
-        <w:spacing w:after="140" w:line="288"/>
-        <w:jc w:val="both"/>
-      </w:pPr>
-      <w:r>
-        <w:rPr>
-          <w:rFonts w:ascii="Calibri" w:cs="Calibri" w:eastAsia="Calibri" w:hAnsi="Calibri"/>
-        </w:rPr>
-        <w:t xml:space="preserve">Tercera, el diseño de seguros y garantías. El error por zona (0.36 t/ha en Hidalgo y Tlaxcala, 0.58 en Puebla) y la trayectoria del vigor del cultivo durante el ciclo permiten detectar a tiempo desviaciones respecto a lo esperado y activar seguros paramétricos o reestructuras antes de la cosecha.</w:t>
-      </w:r>
-    </w:p>
-    <w:p>
-      <w:pPr>
-        <w:spacing w:after="140" w:line="288"/>
-        <w:jc w:val="both"/>
-      </w:pPr>
-      <w:r>
-        <w:rPr>
-          <w:rFonts w:ascii="Calibri" w:cs="Calibri" w:eastAsia="Calibri" w:hAnsi="Calibri"/>
-        </w:rPr>
-        <w:t xml:space="preserve">Para que esto sea inclusión y no exclusión hace falta transparencia: cada estimación se entrega con su rango y con una explicación sencilla de qué la subió o la bajó, para que el productor pueda entenderla, cuestionarla y usarla en su propia negociación con la comercializadora o la financiera.</w:t>
+        <w:t xml:space="preserve">El crédito de avío requiere información sobre la capacidad productiva de la parcela y la situación del productor. CebadaVision aporta una estimación retrospectiva del ciclo 2025 con error medido en validación. Puede servir como evidencia complementaria para estudiar aplicaciones financieras; no se ha validado como sistema de decisión crediticia, de seguros ni de alerta temprana.</w:t>
+      </w:r>
+    </w:p>
+    <w:p>
+      <w:pPr>
+        <w:spacing w:after="140" w:line="288"/>
+        <w:jc w:val="both"/>
+      </w:pPr>
+      <w:r>
+        <w:rPr>
+          <w:rFonts w:ascii="Calibri" w:cs="Calibri" w:eastAsia="Calibri" w:hAnsi="Calibri"/>
+        </w:rPr>
+        <w:t xml:space="preserve">Una primera aplicación potencial es explorar escenarios de valor de cosecha combinando rendimiento, superficie y precio de referencia. El margen orientativo del modelo permite ilustrar sensibilidad, pero no constituye una pérdida máxima ni una garantía de pago. Los terciles bajo/medio/alto de la aplicación clasifican rendimiento, no probabilidad de incumplimiento.</w:t>
+      </w:r>
+    </w:p>
+    <w:p>
+      <w:pPr>
+        <w:spacing w:after="140" w:line="288"/>
+        <w:jc w:val="both"/>
+      </w:pPr>
+      <w:r>
+        <w:rPr>
+          <w:rFonts w:ascii="Calibri" w:cs="Calibri" w:eastAsia="Calibri" w:hAnsi="Calibri"/>
+        </w:rPr>
+        <w:t xml:space="preserve">Una segunda posibilidad es complementar la evaluación de productores sin historial crediticio con información trazable de sus parcelas. Debe comprobarse que el uso de la ubicación no reproduzca desventajas territoriales: el R² global oculta diferencias importantes de desempeño entre estados. La estimación no sustituye la verificación de identidad, manejo, costos u otras condiciones del productor, ni justifica por sí sola otorgar o rechazar crédito.</w:t>
+      </w:r>
+    </w:p>
+    <w:p>
+      <w:pPr>
+        <w:spacing w:after="140" w:line="288"/>
+        <w:jc w:val="both"/>
+      </w:pPr>
+      <w:r>
+        <w:rPr>
+          <w:rFonts w:ascii="Calibri" w:cs="Calibri" w:eastAsia="Calibri" w:hAnsi="Calibri"/>
+        </w:rPr>
+        <w:t xml:space="preserve">El estudio utiliza observaciones hasta noviembre de 2025. Por tanto, detectar desviaciones y activar seguros o reestructuras antes de la cosecha son aplicaciones futuras: requieren fijar una fecha de corte, reconstruir únicamente las variables disponibles entonces y validar con ciclos independientes. Actualizar el sistema cada ciclo también exige datos nuevos, evaluación de cambios y recalibración; esa capacidad no está demostrada aquí.</w:t>
+      </w:r>
+    </w:p>
+    <w:p>
+      <w:pPr>
+        <w:spacing w:after="140" w:line="288"/>
+        <w:jc w:val="both"/>
+      </w:pPr>
+      <w:r>
+        <w:rPr>
+          <w:rFonts w:ascii="Calibri" w:cs="Calibri" w:eastAsia="Calibri" w:hAnsi="Calibri"/>
+        </w:rPr>
+        <w:t xml:space="preserve">La transparencia implica distinguir las predicciones del ensamble de las simulaciones Ridge, explicar las limitaciones del margen y permitir que productores y analistas cuestionen los resultados. Una prueba operativa con FIRA podría evaluar utilidad, equidad y desempeño antes de su adopción.</w:t>
       </w:r>
     </w:p>
     <w:p>
       <w:pPr>
         <w:pStyle w:val="Heading1"/>
-        <w:spacing w:before="280" w:after="120"/>
+        <w:spacing w:after="120" w:before="280"/>
       </w:pPr>
       <w:r>
         <w:rPr>
@@ -699,55 +699,67 @@
         <w:rPr>
           <w:rFonts w:ascii="Calibri" w:cs="Calibri" w:eastAsia="Calibri" w:hAnsi="Calibri"/>
         </w:rPr>
-        <w:t xml:space="preserve">Se construyó un modelo reproducible que predice el rendimiento de grano de parcelas de cebada de temporal en Hidalgo, Tlaxcala y Puebla con RMSE de 0.491 ± 0.007 t/ha, MAE de 0.336 y R² de 0.664 en validación cruzada estratificada por estado y repetida diez veces, frente a 0.851 del promedio regional y 0.501 de un kNN espacial. El modelo final es un ensamble de LightGBM y Random Forest sobre ubicación, relieve, clima y fenología de Planet, y entrega las 59 predicciones solicitadas con promedio de 3.95 t/ha y un rango al 80 % de ±0.63 t/ha.</w:t>
-      </w:r>
-    </w:p>
-    <w:p>
-      <w:pPr>
-        <w:spacing w:after="140" w:line="288"/>
-        <w:jc w:val="both"/>
-      </w:pPr>
-      <w:r>
-        <w:rPr>
-          <w:rFonts w:ascii="Calibri" w:cs="Calibri" w:eastAsia="Calibri" w:hAnsi="Calibri"/>
-        </w:rPr>
-        <w:t xml:space="preserve">El hallazgo principal es estructural: la ubicación de la parcela explica cerca de dos tercios de la variación del rendimiento, porque las tres zonas rinden distinto y porque parcelas vecinas comparten suelo, clima y manejo. Un modelo que ignore esto subestima su error o atribuye a los índices satelitales un mérito que pertenece a la geografía. Evaluar las variables dentro de esa estructura permitió responder las preguntas guía con evidencia comparable: el índice más importante es el EVI de Planet, por su señal en la emergencia y en el secado; la variable climática con mayor peso es la precipitación del ciclo, en particular su anomalía respecto a 2022–2024; y la mejor combinación es ubicación + relieve + clima + fenología de Planet; sumar Sentinel-2 no mejora.</w:t>
-      </w:r>
-    </w:p>
-    <w:p>
-      <w:pPr>
-        <w:spacing w:after="140" w:line="288"/>
-        <w:jc w:val="both"/>
-      </w:pPr>
-      <w:r>
-        <w:rPr>
-          <w:rFonts w:ascii="Calibri" w:cs="Calibri" w:eastAsia="Calibri" w:hAnsi="Calibri"/>
-        </w:rPr>
-        <w:t xml:space="preserve">Las limitaciones se declaran en la aplicación: rendimiento de origen comercial, redondeado en una zona; clima a 5 km con solo 25 valores distintos; 138 parcelas de un solo ciclo; variedad, fecha de siembra, dosis y siniestros desconocidos. Por eso el aporte de los índices sobre la ubicación es pequeño, aunque mejora la extrapolación a municipios no vistos.</w:t>
-      </w:r>
-    </w:p>
-    <w:p>
-      <w:pPr>
-        <w:spacing w:after="140" w:line="288"/>
-        <w:jc w:val="both"/>
-      </w:pPr>
-      <w:r>
-        <w:rPr>
-          <w:rFonts w:ascii="Calibri" w:cs="Calibri" w:eastAsia="Calibri" w:hAnsi="Calibri"/>
-        </w:rPr>
-        <w:t xml:space="preserve">La aplicación CebadaVision ejecuta el modelo en el navegador, muestra las 197 parcelas en un mapa, permite buscar cada una por su identificador, presenta la estimación con rango y semáforo, explica con palabras sencillas cómo se llegó al número y ofrece un simulador y la descarga del CSV, con prioridad en el productor.</w:t>
-      </w:r>
-    </w:p>
-    <w:p>
-      <w:pPr>
-        <w:spacing w:after="140" w:line="288"/>
-        <w:jc w:val="both"/>
-      </w:pPr>
-      <w:r>
-        <w:rPr>
-          <w:rFonts w:ascii="Calibri" w:cs="Calibri" w:eastAsia="Calibri" w:hAnsi="Calibri"/>
-        </w:rPr>
-        <w:t xml:space="preserve">Como siguiente paso, el mismo pipeline se extendería a varios ciclos y a rendimientos medidos en campo, para modelar con la fenología lo que la ubicación no explica, estimar antes de la cosecha y calibrar el rango por zona. Con FIRA, el modelo podría integrarse a la originación de crédito de avío como variable objetiva de capacidad productiva por parcela.</w:t>
+        <w:t xml:space="preserve">Se construyó un modelo reproducible de rendimiento de grano de cebada de temporal en Hidalgo, Tlaxcala y Puebla. En validación cruzada estratificada por estado y repetida diez veces obtuvo RMSE 0.491 ± 0.007 t/ha, MAE 0.336 y R² 0.664. El ensamble de LightGBM y Random Forest entrega las 59 predicciones solicitadas, con promedio 3.95 t/ha. Frente al kNN espacial (0.501), la reducción observada de 0.010 t/ha es pequeña y no demuestra superioridad estadística; sí es amplia frente al promedio regional (0.851). El margen ±0.63 t/ha es orientativo, sin cobertura del 80 % calibrada.</w:t>
+      </w:r>
+    </w:p>
+    <w:p>
+      <w:pPr>
+        <w:spacing w:after="140" w:line="288"/>
+        <w:jc w:val="both"/>
+      </w:pPr>
+      <w:r>
+        <w:rPr>
+          <w:rFonts w:ascii="Calibri" w:cs="Calibri" w:eastAsia="Calibri" w:hAnsi="Calibri"/>
+        </w:rPr>
+        <w:t xml:space="preserve">La ubicación concentra gran parte de la señal predictiva. Evaluar los demás grupos dentro de esa estructura permitió responder las preguntas guía: EVI de Planet destaca entre los índices; la precipitación y su anomalía respecto a 2022–2024 destacan al evaluar clima por separado; y ubicación, relieve, clima y fenología de Planet ofrecen la combinación con menor error observado en la ablación. Estas asociaciones no prueban efectos causales del manejo o del clima.</w:t>
+      </w:r>
+    </w:p>
+    <w:p>
+      <w:pPr>
+        <w:spacing w:after="140" w:line="288"/>
+        <w:jc w:val="both"/>
+      </w:pPr>
+      <w:r>
+        <w:rPr>
+          <w:rFonts w:ascii="Calibri" w:cs="Calibri" w:eastAsia="Calibri" w:hAnsi="Calibri"/>
+        </w:rPr>
+        <w:t xml:space="preserve">El desempeño varía por estado. Los R² de 0.784 en Hidalgo, 0.007 en Puebla y −0.026 en Tlaxcala impiden extender la interpretación del R² global a todas las parcelas. La validación por municipio es favorable en esta muestra, pero no demuestra desempeño en regiones o ciclos nuevos.</w:t>
+      </w:r>
+    </w:p>
+    <w:p>
+      <w:pPr>
+        <w:spacing w:after="140" w:line="288"/>
+        <w:jc w:val="both"/>
+      </w:pPr>
+      <w:r>
+        <w:rPr>
+          <w:rFonts w:ascii="Calibri" w:cs="Calibri" w:eastAsia="Calibri" w:hAnsi="Calibri"/>
+        </w:rPr>
+        <w:t xml:space="preserve">Las limitaciones incluyen 138 rendimientos conocidos de un solo ciclo, pesaje en báscula sin ajustes por humedad, impurezas o mermas, redondeo en Tlaxcala, clima a unos 5 km y ausencia de información de manejo. Se requieren más ciclos y documentación de la calidad del pesaje.</w:t>
+      </w:r>
+    </w:p>
+    <w:p>
+      <w:pPr>
+        <w:spacing w:after="140" w:line="288"/>
+        <w:jc w:val="both"/>
+      </w:pPr>
+      <w:r>
+        <w:rPr>
+          <w:rFonts w:ascii="Calibri" w:cs="Calibri" w:eastAsia="Calibri" w:hAnsi="Calibri"/>
+        </w:rPr>
+        <w:t xml:space="preserve">La aplicación muestra predicciones y explicaciones precalculadas del ensamble. Su simulador ejecuta una regresión Ridge sustituta cuya discrepancia de ajuste frente al ensamble es 0.3161 t/ha; no tiene el mismo desempeño validado ni representa intervenciones causales.</w:t>
+      </w:r>
+    </w:p>
+    <w:p>
+      <w:pPr>
+        <w:spacing w:after="140" w:line="288"/>
+        <w:jc w:val="both"/>
+      </w:pPr>
+      <w:r>
+        <w:rPr>
+          <w:rFonts w:ascii="Calibri" w:cs="Calibri" w:eastAsia="Calibri" w:hAnsi="Calibri"/>
+        </w:rPr>
+        <w:t xml:space="preserve">Como siguiente paso se propone calibrar la incertidumbre y evaluar predicción anticipada con fechas de corte explícitas y datos disponibles en cada fecha. El análisis actual usa observaciones hasta noviembre de 2025: las alertas precosecha, la actualización por ciclo y la incorporación a decisiones financieras requieren validación temporal y operativa adicional.</w:t>
       </w:r>
     </w:p>
     <w:sectPr>
@@ -762,6 +774,43 @@
 
 <file path=word/comments.xml><?xml version="1.0" encoding="utf-8"?>
 <w:comments xmlns:cx="http://schemas.microsoft.com/office/drawing/2014/chartex" xmlns:cx1="http://schemas.microsoft.com/office/drawing/2015/9/8/chartex" xmlns:cx2="http://schemas.microsoft.com/office/drawing/2015/10/21/chartex" xmlns:cx3="http://schemas.microsoft.com/office/drawing/2016/5/9/chartex" xmlns:cx4="http://schemas.microsoft.com/office/drawing/2016/5/10/chartex" xmlns:cx5="http://schemas.microsoft.com/office/drawing/2016/5/11/chartex" xmlns:cx6="http://schemas.microsoft.com/office/drawing/2016/5/12/chartex" xmlns:cx7="http://schemas.microsoft.com/office/drawing/2016/5/13/chartex" xmlns:cx8="http://schemas.microsoft.com/office/drawing/2016/5/14/chartex" xmlns:mc="http://schemas.openxmlformats.org/markup-compatibility/2006" xmlns:aink="http://schemas.microsoft.com/office/drawing/2016/ink" xmlns:am3d="http://schemas.microsoft.com/office/drawing/2017/model3d" xmlns:o="urn:schemas-microsoft-com:office:office" xmlns:r="http://schemas.openxmlformats.org/officeDocument/2006/relationships" xmlns:m="http://schemas.openxmlformats.org/officeDocument/2006/math" xmlns:v="urn:schemas-microsoft-com:vml" xmlns:wp14="http://schemas.microsoft.com/office/word/2010/wordprocessingDrawing" xmlns:wp="http://schemas.openxmlformats.org/drawingml/2006/wordprocessingDrawing" xmlns:w10="urn:schemas-microsoft-com:office:word" xmlns:w="http://schemas.openxmlformats.org/wordprocessingml/2006/main" xmlns:w14="http://schemas.microsoft.com/office/word/2010/wordml" xmlns:w15="http://schemas.microsoft.com/office/word/2012/wordml" xmlns:w16cex="http://schemas.microsoft.com/office/word/2018/wordml/cex" xmlns:w16cid="http://schemas.microsoft.com/office/word/2016/wordml/cid" xmlns:w16="http://schemas.microsoft.com/office/word/2018/wordml" xmlns:w16sdtdh="http://schemas.microsoft.com/office/word/2020/wordml/sdtdatahash" xmlns:w16se="http://schemas.microsoft.com/office/word/2015/wordml/symex" xmlns:wpg="http://schemas.microsoft.com/office/word/2010/wordprocessingGroup" xmlns:wpi="http://schemas.microsoft.com/office/word/2010/wordprocessingInk" xmlns:wne="http://schemas.microsoft.com/office/word/2006/wordml" xmlns:wps="http://schemas.microsoft.com/office/word/2010/wordprocessingShape"/>
+</file>
+
+<file path=word/endnotes.xml><?xml version="1.0" encoding="utf-8"?>
+<w:endnotes xmlns:wpc="http://schemas.microsoft.com/office/word/2010/wordprocessingCanvas" xmlns:mc="http://schemas.openxmlformats.org/markup-compatibility/2006" xmlns:o="urn:schemas-microsoft-com:office:office" xmlns:r="http://schemas.openxmlformats.org/officeDocument/2006/relationships" xmlns:m="http://schemas.openxmlformats.org/officeDocument/2006/math" xmlns:v="urn:schemas-microsoft-com:vml" xmlns:wp14="http://schemas.microsoft.com/office/word/2010/wordprocessingDrawing" xmlns:wp="http://schemas.openxmlformats.org/drawingml/2006/wordprocessingDrawing" xmlns:w10="urn:schemas-microsoft-com:office:word" xmlns:w="http://schemas.openxmlformats.org/wordprocessingml/2006/main" xmlns:w14="http://schemas.microsoft.com/office/word/2010/wordml" xmlns:w15="http://schemas.microsoft.com/office/word/2012/wordml" xmlns:wpg="http://schemas.microsoft.com/office/word/2010/wordprocessingGroup" xmlns:wpi="http://schemas.microsoft.com/office/word/2010/wordprocessingInk" xmlns:wne="http://schemas.microsoft.com/office/word/2006/wordml" xmlns:wps="http://schemas.microsoft.com/office/word/2010/wordprocessingShape" mc:Ignorable="w14 w15 wp14">
+  <w:endnote w:type="separator" w:id="-1">
+    <w:p>
+      <w:pPr>
+        <w:spacing w:after="0" w:line="240" w:lineRule="auto"/>
+      </w:pPr>
+      <w:r>
+        <w:rPr>
+          <w:rStyle w:val="EndnoteReference"/>
+        </w:rPr>
+        <w:endnoteRef/>
+      </w:r>
+      <w:r>
+        <w:separator/>
+      </w:r>
+    </w:p>
+  </w:endnote>
+  <w:endnote w:type="continuationSeparator" w:id="0">
+    <w:p>
+      <w:pPr>
+        <w:spacing w:after="0" w:line="240" w:lineRule="auto"/>
+      </w:pPr>
+      <w:r>
+        <w:rPr>
+          <w:rStyle w:val="EndnoteReference"/>
+        </w:rPr>
+        <w:endnoteRef/>
+      </w:r>
+      <w:r>
+        <w:continuationSeparator/>
+      </w:r>
+    </w:p>
+  </w:endnote>
+</w:endnotes>
 </file>
 
 <file path=word/footnotes.xml><?xml version="1.0" encoding="utf-8"?>
@@ -1072,5 +1121,42 @@
       <w:szCs w:val="20"/>
     </w:rPr>
   </w:style>
+  <w:style w:type="character" w:styleId="EndnoteReference">
+    <w:name w:val="endnote reference"/>
+    <w:basedOn w:val="DefaultParagraphFont"/>
+    <w:uiPriority w:val="99"/>
+    <w:semiHidden/>
+    <w:unhideWhenUsed/>
+    <w:rPr>
+      <w:vertAlign w:val="superscript"/>
+    </w:rPr>
+  </w:style>
+  <w:style w:type="paragraph" w:styleId="EndnoteText">
+    <w:name w:val="endnote text"/>
+    <w:basedOn w:val="Normal"/>
+    <w:link w:val="EndnoteTextChar"/>
+    <w:uiPriority w:val="99"/>
+    <w:semiHidden/>
+    <w:unhideWhenUsed/>
+    <w:pPr>
+      <w:spacing w:after="0" w:line="240" w:lineRule="auto"/>
+    </w:pPr>
+    <w:rPr>
+      <w:sz w:val="20"/>
+      <w:szCs w:val="20"/>
+    </w:rPr>
+  </w:style>
+  <w:style w:type="character" w:styleId="EndnoteTextChar">
+    <w:name w:val="Endnote Text Char"/>
+    <w:basedOn w:val="DefaultParagraphFont"/>
+    <w:link w:val="EndnoteText"/>
+    <w:uiPriority w:val="99"/>
+    <w:semiHidden/>
+    <w:unhideWhenUsed/>
+    <w:rPr>
+      <w:sz w:val="20"/>
+      <w:szCs w:val="20"/>
+    </w:rPr>
+  </w:style>
 </w:styles>
 </file>
</xml_diff>